<commit_message>
Adv JS: Session, Cookie, Local Storage, Caching
</commit_message>
<xml_diff>
--- a/AdvJS/Local Storage.docx
+++ b/AdvJS/Local Storage.docx
@@ -514,11 +514,19 @@
         </w:rPr>
         <w:t xml:space="preserve"> </w:t>
       </w:r>
-      <w:r>
-        <w:rPr>
-          <w:rFonts w:ascii="Times New Roman" w:hAnsi="Times New Roman" w:cs="Times New Roman"/>
-        </w:rPr>
-        <w:t>session.addEventListener() etc.</w:t>
+      <w:proofErr w:type="spellStart"/>
+      <w:r>
+        <w:rPr>
+          <w:rFonts w:ascii="Times New Roman" w:hAnsi="Times New Roman" w:cs="Times New Roman"/>
+        </w:rPr>
+        <w:t>session.addEventListener</w:t>
+      </w:r>
+      <w:proofErr w:type="spellEnd"/>
+      <w:r>
+        <w:rPr>
+          <w:rFonts w:ascii="Times New Roman" w:hAnsi="Times New Roman" w:cs="Times New Roman"/>
+        </w:rPr>
+        <w:t>() etc.</w:t>
       </w:r>
     </w:p>
     <w:p>
@@ -976,8 +984,18 @@
           <w:b/>
           <w:bCs/>
         </w:rPr>
-        <w:t>e: setItem</w:t>
-      </w:r>
+        <w:t xml:space="preserve">e: </w:t>
+      </w:r>
+      <w:proofErr w:type="spellStart"/>
+      <w:r>
+        <w:rPr>
+          <w:rFonts w:ascii="Times New Roman" w:hAnsi="Times New Roman" w:cs="Times New Roman"/>
+          <w:b/>
+          <w:bCs/>
+        </w:rPr>
+        <w:t>setItem</w:t>
+      </w:r>
+      <w:proofErr w:type="spellEnd"/>
       <w:r>
         <w:rPr>
           <w:rFonts w:ascii="Times New Roman" w:hAnsi="Times New Roman" w:cs="Times New Roman"/>
@@ -1002,7 +1020,21 @@
         <w:rPr>
           <w:rFonts w:ascii="Times New Roman" w:hAnsi="Times New Roman" w:cs="Times New Roman"/>
         </w:rPr>
-        <w:t>It must have 2 args(key, value), o/w it will give ERROR.</w:t>
+        <w:t xml:space="preserve">It must have 2 </w:t>
+      </w:r>
+      <w:proofErr w:type="spellStart"/>
+      <w:r>
+        <w:rPr>
+          <w:rFonts w:ascii="Times New Roman" w:hAnsi="Times New Roman" w:cs="Times New Roman"/>
+        </w:rPr>
+        <w:t>args</w:t>
+      </w:r>
+      <w:proofErr w:type="spellEnd"/>
+      <w:r>
+        <w:rPr>
+          <w:rFonts w:ascii="Times New Roman" w:hAnsi="Times New Roman" w:cs="Times New Roman"/>
+        </w:rPr>
+        <w:t>(key, value), o/w it will give ERROR.</w:t>
       </w:r>
     </w:p>
     <w:p>
@@ -1070,6 +1102,7 @@
         </w:rPr>
         <w:t xml:space="preserve">For fetch/access data from local storage: </w:t>
       </w:r>
+      <w:proofErr w:type="spellStart"/>
       <w:r>
         <w:rPr>
           <w:rFonts w:ascii="Times New Roman" w:hAnsi="Times New Roman" w:cs="Times New Roman"/>
@@ -1078,6 +1111,7 @@
         </w:rPr>
         <w:t>getItem</w:t>
       </w:r>
+      <w:proofErr w:type="spellEnd"/>
       <w:r>
         <w:rPr>
           <w:rFonts w:ascii="Times New Roman" w:hAnsi="Times New Roman" w:cs="Times New Roman"/>
@@ -1274,13 +1308,23 @@
         </w:rPr>
         <w:t xml:space="preserve">For remove particular data from local storage using key value: </w:t>
       </w:r>
-      <w:r>
-        <w:rPr>
-          <w:rFonts w:ascii="Times New Roman" w:hAnsi="Times New Roman" w:cs="Times New Roman"/>
-          <w:b/>
-          <w:bCs/>
-        </w:rPr>
-        <w:t>removeItem(“&lt;key name&gt;”)</w:t>
+      <w:proofErr w:type="spellStart"/>
+      <w:r>
+        <w:rPr>
+          <w:rFonts w:ascii="Times New Roman" w:hAnsi="Times New Roman" w:cs="Times New Roman"/>
+          <w:b/>
+          <w:bCs/>
+        </w:rPr>
+        <w:t>removeItem</w:t>
+      </w:r>
+      <w:proofErr w:type="spellEnd"/>
+      <w:r>
+        <w:rPr>
+          <w:rFonts w:ascii="Times New Roman" w:hAnsi="Times New Roman" w:cs="Times New Roman"/>
+          <w:b/>
+          <w:bCs/>
+        </w:rPr>
+        <w:t>(“&lt;key name&gt;”)</w:t>
       </w:r>
     </w:p>
     <w:p>
@@ -1744,13 +1788,41 @@
           <w:bCs/>
         </w:rPr>
       </w:pPr>
-      <w:r>
-        <w:rPr>
-          <w:rFonts w:ascii="Times New Roman" w:hAnsi="Times New Roman" w:cs="Times New Roman"/>
-          <w:b/>
-          <w:bCs/>
-        </w:rPr>
-        <w:t>JSON.stringify(&lt;obj nam</w:t>
+      <w:proofErr w:type="spellStart"/>
+      <w:r>
+        <w:rPr>
+          <w:rFonts w:ascii="Times New Roman" w:hAnsi="Times New Roman" w:cs="Times New Roman"/>
+          <w:b/>
+          <w:bCs/>
+        </w:rPr>
+        <w:t>JSON.stringify</w:t>
+      </w:r>
+      <w:proofErr w:type="spellEnd"/>
+      <w:r>
+        <w:rPr>
+          <w:rFonts w:ascii="Times New Roman" w:hAnsi="Times New Roman" w:cs="Times New Roman"/>
+          <w:b/>
+          <w:bCs/>
+        </w:rPr>
+        <w:t>(&lt;</w:t>
+      </w:r>
+      <w:proofErr w:type="spellStart"/>
+      <w:r>
+        <w:rPr>
+          <w:rFonts w:ascii="Times New Roman" w:hAnsi="Times New Roman" w:cs="Times New Roman"/>
+          <w:b/>
+          <w:bCs/>
+        </w:rPr>
+        <w:t>obj</w:t>
+      </w:r>
+      <w:proofErr w:type="spellEnd"/>
+      <w:r>
+        <w:rPr>
+          <w:rFonts w:ascii="Times New Roman" w:hAnsi="Times New Roman" w:cs="Times New Roman"/>
+          <w:b/>
+          <w:bCs/>
+        </w:rPr>
+        <w:t xml:space="preserve"> nam</w:t>
       </w:r>
       <w:r>
         <w:rPr>
@@ -2130,6 +2202,7 @@
           <w:bCs/>
         </w:rPr>
       </w:pPr>
+      <w:proofErr w:type="spellStart"/>
       <w:r>
         <w:rPr>
           <w:rFonts w:ascii="Times New Roman" w:hAnsi="Times New Roman" w:cs="Times New Roman"/>
@@ -2146,6 +2219,7 @@
         </w:rPr>
         <w:t>ocument.cookie</w:t>
       </w:r>
+      <w:proofErr w:type="spellEnd"/>
       <w:r>
         <w:rPr>
           <w:rFonts w:ascii="Times New Roman" w:hAnsi="Times New Roman" w:cs="Times New Roman"/>
@@ -2198,7 +2272,21 @@
         <w:rPr>
           <w:rFonts w:ascii="Times New Roman" w:hAnsi="Times New Roman" w:cs="Times New Roman"/>
         </w:rPr>
-        <w:t>when user visits same webApp second time.</w:t>
+        <w:t xml:space="preserve">when user visits same </w:t>
+      </w:r>
+      <w:proofErr w:type="spellStart"/>
+      <w:r>
+        <w:rPr>
+          <w:rFonts w:ascii="Times New Roman" w:hAnsi="Times New Roman" w:cs="Times New Roman"/>
+        </w:rPr>
+        <w:t>webApp</w:t>
+      </w:r>
+      <w:proofErr w:type="spellEnd"/>
+      <w:r>
+        <w:rPr>
+          <w:rFonts w:ascii="Times New Roman" w:hAnsi="Times New Roman" w:cs="Times New Roman"/>
+        </w:rPr>
+        <w:t xml:space="preserve"> second time.</w:t>
       </w:r>
     </w:p>
     <w:p>
@@ -2242,7 +2330,25 @@
           <w:b/>
           <w:bCs/>
         </w:rPr>
-        <w:t xml:space="preserve">Use: document.cookie() : </w:t>
+        <w:t xml:space="preserve">Use: </w:t>
+      </w:r>
+      <w:proofErr w:type="spellStart"/>
+      <w:r>
+        <w:rPr>
+          <w:rFonts w:ascii="Times New Roman" w:hAnsi="Times New Roman" w:cs="Times New Roman"/>
+          <w:b/>
+          <w:bCs/>
+        </w:rPr>
+        <w:t>document.cookie</w:t>
+      </w:r>
+      <w:proofErr w:type="spellEnd"/>
+      <w:r>
+        <w:rPr>
+          <w:rFonts w:ascii="Times New Roman" w:hAnsi="Times New Roman" w:cs="Times New Roman"/>
+          <w:b/>
+          <w:bCs/>
+        </w:rPr>
+        <w:t xml:space="preserve">() : </w:t>
       </w:r>
       <w:r>
         <w:rPr>
@@ -2993,6 +3099,7 @@
           <w14:ligatures w14:val="none"/>
         </w:rPr>
       </w:pPr>
+      <w:proofErr w:type="spellStart"/>
       <w:r>
         <w:rPr>
           <w:rFonts w:ascii="Consolas" w:eastAsia="Times New Roman" w:hAnsi="Consolas" w:cs="Times New Roman"/>
@@ -3029,6 +3136,7 @@
         </w:rPr>
         <w:t>cookie</w:t>
       </w:r>
+      <w:proofErr w:type="spellEnd"/>
       <w:r>
         <w:rPr>
           <w:rFonts w:ascii="Consolas" w:eastAsia="Times New Roman" w:hAnsi="Consolas" w:cs="Times New Roman"/>
@@ -3563,7 +3671,33 @@
           <w:lang w:eastAsia="en-IN" w:bidi="gu-IN"/>
           <w14:ligatures w14:val="none"/>
         </w:rPr>
-        <w:t>// document.cookie = key + "=" + value;</w:t>
+        <w:t xml:space="preserve">// </w:t>
+      </w:r>
+      <w:proofErr w:type="spellStart"/>
+      <w:r>
+        <w:rPr>
+          <w:rFonts w:ascii="Consolas" w:eastAsia="Times New Roman" w:hAnsi="Consolas" w:cs="Times New Roman"/>
+          <w:color w:val="7F848E"/>
+          <w:kern w:val="0"/>
+          <w:sz w:val="21"/>
+          <w:szCs w:val="21"/>
+          <w:lang w:eastAsia="en-IN" w:bidi="gu-IN"/>
+          <w14:ligatures w14:val="none"/>
+        </w:rPr>
+        <w:t>document.cookie</w:t>
+      </w:r>
+      <w:proofErr w:type="spellEnd"/>
+      <w:r>
+        <w:rPr>
+          <w:rFonts w:ascii="Consolas" w:eastAsia="Times New Roman" w:hAnsi="Consolas" w:cs="Times New Roman"/>
+          <w:color w:val="7F848E"/>
+          <w:kern w:val="0"/>
+          <w:sz w:val="21"/>
+          <w:szCs w:val="21"/>
+          <w:lang w:eastAsia="en-IN" w:bidi="gu-IN"/>
+          <w14:ligatures w14:val="none"/>
+        </w:rPr>
+        <w:t xml:space="preserve"> = key + "=" + value;</w:t>
       </w:r>
     </w:p>
     <w:p>
@@ -3605,7 +3739,33 @@
           <w:lang w:eastAsia="en-IN" w:bidi="gu-IN"/>
           <w14:ligatures w14:val="none"/>
         </w:rPr>
-        <w:t>// encodeURIComponent() : encode value of cookies key-value before store cookie, For improve security</w:t>
+        <w:t xml:space="preserve">// </w:t>
+      </w:r>
+      <w:proofErr w:type="spellStart"/>
+      <w:r>
+        <w:rPr>
+          <w:rFonts w:ascii="Consolas" w:eastAsia="Times New Roman" w:hAnsi="Consolas" w:cs="Times New Roman"/>
+          <w:color w:val="7F848E"/>
+          <w:kern w:val="0"/>
+          <w:sz w:val="21"/>
+          <w:szCs w:val="21"/>
+          <w:lang w:eastAsia="en-IN" w:bidi="gu-IN"/>
+          <w14:ligatures w14:val="none"/>
+        </w:rPr>
+        <w:t>encodeURIComponent</w:t>
+      </w:r>
+      <w:proofErr w:type="spellEnd"/>
+      <w:r>
+        <w:rPr>
+          <w:rFonts w:ascii="Consolas" w:eastAsia="Times New Roman" w:hAnsi="Consolas" w:cs="Times New Roman"/>
+          <w:color w:val="7F848E"/>
+          <w:kern w:val="0"/>
+          <w:sz w:val="21"/>
+          <w:szCs w:val="21"/>
+          <w:lang w:eastAsia="en-IN" w:bidi="gu-IN"/>
+          <w14:ligatures w14:val="none"/>
+        </w:rPr>
+        <w:t>() : encode value of cookies key-value before store cookie, For improve security</w:t>
       </w:r>
     </w:p>
     <w:p>
@@ -3632,7 +3792,33 @@
           <w:lang w:eastAsia="en-IN" w:bidi="gu-IN"/>
           <w14:ligatures w14:val="none"/>
         </w:rPr>
-        <w:t>// decodeURIComponent() : decode value of cookies key-value after store</w:t>
+        <w:t xml:space="preserve">// </w:t>
+      </w:r>
+      <w:proofErr w:type="spellStart"/>
+      <w:r>
+        <w:rPr>
+          <w:rFonts w:ascii="Consolas" w:eastAsia="Times New Roman" w:hAnsi="Consolas" w:cs="Times New Roman"/>
+          <w:color w:val="7F848E"/>
+          <w:kern w:val="0"/>
+          <w:sz w:val="21"/>
+          <w:szCs w:val="21"/>
+          <w:lang w:eastAsia="en-IN" w:bidi="gu-IN"/>
+          <w14:ligatures w14:val="none"/>
+        </w:rPr>
+        <w:t>decodeURIComponent</w:t>
+      </w:r>
+      <w:proofErr w:type="spellEnd"/>
+      <w:r>
+        <w:rPr>
+          <w:rFonts w:ascii="Consolas" w:eastAsia="Times New Roman" w:hAnsi="Consolas" w:cs="Times New Roman"/>
+          <w:color w:val="7F848E"/>
+          <w:kern w:val="0"/>
+          <w:sz w:val="21"/>
+          <w:szCs w:val="21"/>
+          <w:lang w:eastAsia="en-IN" w:bidi="gu-IN"/>
+          <w14:ligatures w14:val="none"/>
+        </w:rPr>
+        <w:t>() : decode value of cookies key-value after store</w:t>
       </w:r>
     </w:p>
     <w:p>
@@ -3676,6 +3862,7 @@
           <w14:ligatures w14:val="none"/>
         </w:rPr>
       </w:pPr>
+      <w:proofErr w:type="spellStart"/>
       <w:r>
         <w:rPr>
           <w:rFonts w:ascii="Consolas" w:eastAsia="Times New Roman" w:hAnsi="Consolas" w:cs="Times New Roman"/>
@@ -3712,6 +3899,7 @@
         </w:rPr>
         <w:t>cookie</w:t>
       </w:r>
+      <w:proofErr w:type="spellEnd"/>
       <w:r>
         <w:rPr>
           <w:rFonts w:ascii="Consolas" w:eastAsia="Times New Roman" w:hAnsi="Consolas" w:cs="Times New Roman"/>
@@ -3772,6 +3960,7 @@
         </w:rPr>
         <w:t>${</w:t>
       </w:r>
+      <w:proofErr w:type="spellStart"/>
       <w:r>
         <w:rPr>
           <w:rFonts w:ascii="Consolas" w:eastAsia="Times New Roman" w:hAnsi="Consolas" w:cs="Times New Roman"/>
@@ -3784,6 +3973,7 @@
         </w:rPr>
         <w:t>encodeURIComponent</w:t>
       </w:r>
+      <w:proofErr w:type="spellEnd"/>
       <w:r>
         <w:rPr>
           <w:rFonts w:ascii="Consolas" w:eastAsia="Times New Roman" w:hAnsi="Consolas" w:cs="Times New Roman"/>
@@ -3856,6 +4046,7 @@
         </w:rPr>
         <w:t>${</w:t>
       </w:r>
+      <w:proofErr w:type="spellStart"/>
       <w:r>
         <w:rPr>
           <w:rFonts w:ascii="Consolas" w:eastAsia="Times New Roman" w:hAnsi="Consolas" w:cs="Times New Roman"/>
@@ -3868,6 +4059,7 @@
         </w:rPr>
         <w:t>encodeURIComponent</w:t>
       </w:r>
+      <w:proofErr w:type="spellEnd"/>
       <w:r>
         <w:rPr>
           <w:rFonts w:ascii="Consolas" w:eastAsia="Times New Roman" w:hAnsi="Consolas" w:cs="Times New Roman"/>
@@ -4045,6 +4237,7 @@
         </w:rPr>
         <w:t>(</w:t>
       </w:r>
+      <w:proofErr w:type="spellStart"/>
       <w:r>
         <w:rPr>
           <w:rFonts w:ascii="Consolas" w:eastAsia="Times New Roman" w:hAnsi="Consolas" w:cs="Times New Roman"/>
@@ -4081,6 +4274,7 @@
         </w:rPr>
         <w:t>cookie</w:t>
       </w:r>
+      <w:proofErr w:type="spellEnd"/>
       <w:r>
         <w:rPr>
           <w:rFonts w:ascii="Consolas" w:eastAsia="Times New Roman" w:hAnsi="Consolas" w:cs="Times New Roman"/>
@@ -4250,6 +4444,7 @@
           <w14:ligatures w14:val="none"/>
         </w:rPr>
       </w:pPr>
+      <w:proofErr w:type="spellStart"/>
       <w:r>
         <w:rPr>
           <w:rFonts w:ascii="Consolas" w:eastAsia="Times New Roman" w:hAnsi="Consolas" w:cs="Times New Roman"/>
@@ -4286,6 +4481,7 @@
         </w:rPr>
         <w:t>cookie</w:t>
       </w:r>
+      <w:proofErr w:type="spellEnd"/>
       <w:r>
         <w:rPr>
           <w:rFonts w:ascii="Consolas" w:eastAsia="Times New Roman" w:hAnsi="Consolas" w:cs="Times New Roman"/>
@@ -4332,7 +4528,59 @@
           <w:lang w:eastAsia="en-IN" w:bidi="gu-IN"/>
           <w14:ligatures w14:val="none"/>
         </w:rPr>
-        <w:t>"UserName = Nahii; expires=Sat, 19 Oct 2024 09:35:00 GMT"</w:t>
+        <w:t>"</w:t>
+      </w:r>
+      <w:proofErr w:type="spellStart"/>
+      <w:r>
+        <w:rPr>
+          <w:rFonts w:ascii="Consolas" w:eastAsia="Times New Roman" w:hAnsi="Consolas" w:cs="Times New Roman"/>
+          <w:color w:val="98C379"/>
+          <w:kern w:val="0"/>
+          <w:sz w:val="21"/>
+          <w:szCs w:val="21"/>
+          <w:lang w:eastAsia="en-IN" w:bidi="gu-IN"/>
+          <w14:ligatures w14:val="none"/>
+        </w:rPr>
+        <w:t>UserName</w:t>
+      </w:r>
+      <w:proofErr w:type="spellEnd"/>
+      <w:r>
+        <w:rPr>
+          <w:rFonts w:ascii="Consolas" w:eastAsia="Times New Roman" w:hAnsi="Consolas" w:cs="Times New Roman"/>
+          <w:color w:val="98C379"/>
+          <w:kern w:val="0"/>
+          <w:sz w:val="21"/>
+          <w:szCs w:val="21"/>
+          <w:lang w:eastAsia="en-IN" w:bidi="gu-IN"/>
+          <w14:ligatures w14:val="none"/>
+        </w:rPr>
+        <w:t xml:space="preserve"> = </w:t>
+      </w:r>
+      <w:proofErr w:type="spellStart"/>
+      <w:r>
+        <w:rPr>
+          <w:rFonts w:ascii="Consolas" w:eastAsia="Times New Roman" w:hAnsi="Consolas" w:cs="Times New Roman"/>
+          <w:color w:val="98C379"/>
+          <w:kern w:val="0"/>
+          <w:sz w:val="21"/>
+          <w:szCs w:val="21"/>
+          <w:lang w:eastAsia="en-IN" w:bidi="gu-IN"/>
+          <w14:ligatures w14:val="none"/>
+        </w:rPr>
+        <w:t>Nahii</w:t>
+      </w:r>
+      <w:proofErr w:type="spellEnd"/>
+      <w:r>
+        <w:rPr>
+          <w:rFonts w:ascii="Consolas" w:eastAsia="Times New Roman" w:hAnsi="Consolas" w:cs="Times New Roman"/>
+          <w:color w:val="98C379"/>
+          <w:kern w:val="0"/>
+          <w:sz w:val="21"/>
+          <w:szCs w:val="21"/>
+          <w:lang w:eastAsia="en-IN" w:bidi="gu-IN"/>
+          <w14:ligatures w14:val="none"/>
+        </w:rPr>
+        <w:t>; expires=Sat, 19 Oct 2024 09:35:00 GMT"</w:t>
       </w:r>
       <w:r>
         <w:rPr>
@@ -4741,8 +4989,16 @@
         <w:rPr>
           <w:rFonts w:ascii="Times New Roman" w:hAnsi="Times New Roman" w:cs="Times New Roman"/>
         </w:rPr>
-        <w:t>Caching == Memosation</w:t>
-      </w:r>
+        <w:t xml:space="preserve">Caching == </w:t>
+      </w:r>
+      <w:proofErr w:type="spellStart"/>
+      <w:r>
+        <w:rPr>
+          <w:rFonts w:ascii="Times New Roman" w:hAnsi="Times New Roman" w:cs="Times New Roman"/>
+        </w:rPr>
+        <w:t>Memosation</w:t>
+      </w:r>
+      <w:proofErr w:type="spellEnd"/>
     </w:p>
     <w:p>
       <w:pPr>
@@ -4862,14 +5118,6 @@
         </w:rPr>
         <w:t>Part of OOP:</w:t>
       </w:r>
-    </w:p>
-    <w:p>
-      <w:pPr>
-        <w:pStyle w:val="ListParagraph"/>
-        <w:rPr>
-          <w:rFonts w:ascii="Times New Roman" w:hAnsi="Times New Roman" w:cs="Times New Roman"/>
-        </w:rPr>
-      </w:pPr>
     </w:p>
     <w:p>
       <w:pPr>

</xml_diff>

<commit_message>
callback function and it's issues callback hell, IOC
</commit_message>
<xml_diff>
--- a/AdvJS/Local Storage.docx
+++ b/AdvJS/Local Storage.docx
@@ -514,11 +514,21 @@
         </w:rPr>
         <w:t xml:space="preserve"> </w:t>
       </w:r>
-      <w:r>
-        <w:rPr>
-          <w:rFonts w:ascii="Times New Roman" w:hAnsi="Times New Roman" w:cs="Times New Roman"/>
-        </w:rPr>
-        <w:t>session.addEventListener() etc.</w:t>
+      <w:proofErr w:type="spellStart"/>
+      <w:proofErr w:type="gramStart"/>
+      <w:r>
+        <w:rPr>
+          <w:rFonts w:ascii="Times New Roman" w:hAnsi="Times New Roman" w:cs="Times New Roman"/>
+        </w:rPr>
+        <w:t>session.addEventListener</w:t>
+      </w:r>
+      <w:proofErr w:type="spellEnd"/>
+      <w:proofErr w:type="gramEnd"/>
+      <w:r>
+        <w:rPr>
+          <w:rFonts w:ascii="Times New Roman" w:hAnsi="Times New Roman" w:cs="Times New Roman"/>
+        </w:rPr>
+        <w:t>() etc.</w:t>
       </w:r>
     </w:p>
     <w:p>
@@ -976,15 +986,35 @@
           <w:b/>
           <w:bCs/>
         </w:rPr>
-        <w:t>e: setItem</w:t>
-      </w:r>
-      <w:r>
-        <w:rPr>
-          <w:rFonts w:ascii="Times New Roman" w:hAnsi="Times New Roman" w:cs="Times New Roman"/>
-          <w:b/>
-          <w:bCs/>
-        </w:rPr>
-        <w:t>()</w:t>
+        <w:t xml:space="preserve">e: </w:t>
+      </w:r>
+      <w:proofErr w:type="spellStart"/>
+      <w:proofErr w:type="gramStart"/>
+      <w:r>
+        <w:rPr>
+          <w:rFonts w:ascii="Times New Roman" w:hAnsi="Times New Roman" w:cs="Times New Roman"/>
+          <w:b/>
+          <w:bCs/>
+        </w:rPr>
+        <w:t>setItem</w:t>
+      </w:r>
+      <w:proofErr w:type="spellEnd"/>
+      <w:r>
+        <w:rPr>
+          <w:rFonts w:ascii="Times New Roman" w:hAnsi="Times New Roman" w:cs="Times New Roman"/>
+          <w:b/>
+          <w:bCs/>
+        </w:rPr>
+        <w:t>(</w:t>
+      </w:r>
+      <w:proofErr w:type="gramEnd"/>
+      <w:r>
+        <w:rPr>
+          <w:rFonts w:ascii="Times New Roman" w:hAnsi="Times New Roman" w:cs="Times New Roman"/>
+          <w:b/>
+          <w:bCs/>
+        </w:rPr>
+        <w:t>)</w:t>
       </w:r>
     </w:p>
     <w:p>
@@ -1002,7 +1032,29 @@
         <w:rPr>
           <w:rFonts w:ascii="Times New Roman" w:hAnsi="Times New Roman" w:cs="Times New Roman"/>
         </w:rPr>
-        <w:t>It must have 2 args(key, value), o/w it will give ERROR.</w:t>
+        <w:t xml:space="preserve">It must have 2 </w:t>
+      </w:r>
+      <w:proofErr w:type="spellStart"/>
+      <w:proofErr w:type="gramStart"/>
+      <w:r>
+        <w:rPr>
+          <w:rFonts w:ascii="Times New Roman" w:hAnsi="Times New Roman" w:cs="Times New Roman"/>
+        </w:rPr>
+        <w:t>args</w:t>
+      </w:r>
+      <w:proofErr w:type="spellEnd"/>
+      <w:r>
+        <w:rPr>
+          <w:rFonts w:ascii="Times New Roman" w:hAnsi="Times New Roman" w:cs="Times New Roman"/>
+        </w:rPr>
+        <w:t>(</w:t>
+      </w:r>
+      <w:proofErr w:type="gramEnd"/>
+      <w:r>
+        <w:rPr>
+          <w:rFonts w:ascii="Times New Roman" w:hAnsi="Times New Roman" w:cs="Times New Roman"/>
+        </w:rPr>
+        <w:t>key, value), o/w it will give ERROR.</w:t>
       </w:r>
     </w:p>
     <w:p>
@@ -1070,6 +1122,8 @@
         </w:rPr>
         <w:t xml:space="preserve">For fetch/access data from local storage: </w:t>
       </w:r>
+      <w:proofErr w:type="spellStart"/>
+      <w:proofErr w:type="gramStart"/>
       <w:r>
         <w:rPr>
           <w:rFonts w:ascii="Times New Roman" w:hAnsi="Times New Roman" w:cs="Times New Roman"/>
@@ -1078,13 +1132,23 @@
         </w:rPr>
         <w:t>getItem</w:t>
       </w:r>
-      <w:r>
-        <w:rPr>
-          <w:rFonts w:ascii="Times New Roman" w:hAnsi="Times New Roman" w:cs="Times New Roman"/>
-          <w:b/>
-          <w:bCs/>
-        </w:rPr>
-        <w:t>(“&lt;key name&gt;”)</w:t>
+      <w:proofErr w:type="spellEnd"/>
+      <w:r>
+        <w:rPr>
+          <w:rFonts w:ascii="Times New Roman" w:hAnsi="Times New Roman" w:cs="Times New Roman"/>
+          <w:b/>
+          <w:bCs/>
+        </w:rPr>
+        <w:t>(</w:t>
+      </w:r>
+      <w:proofErr w:type="gramEnd"/>
+      <w:r>
+        <w:rPr>
+          <w:rFonts w:ascii="Times New Roman" w:hAnsi="Times New Roman" w:cs="Times New Roman"/>
+          <w:b/>
+          <w:bCs/>
+        </w:rPr>
+        <w:t>“&lt;key name&gt;”)</w:t>
       </w:r>
     </w:p>
     <w:p>
@@ -1274,13 +1338,33 @@
         </w:rPr>
         <w:t xml:space="preserve">For remove particular data from local storage using key value: </w:t>
       </w:r>
-      <w:r>
-        <w:rPr>
-          <w:rFonts w:ascii="Times New Roman" w:hAnsi="Times New Roman" w:cs="Times New Roman"/>
-          <w:b/>
-          <w:bCs/>
-        </w:rPr>
-        <w:t>removeItem(“&lt;key name&gt;”)</w:t>
+      <w:proofErr w:type="spellStart"/>
+      <w:proofErr w:type="gramStart"/>
+      <w:r>
+        <w:rPr>
+          <w:rFonts w:ascii="Times New Roman" w:hAnsi="Times New Roman" w:cs="Times New Roman"/>
+          <w:b/>
+          <w:bCs/>
+        </w:rPr>
+        <w:t>removeItem</w:t>
+      </w:r>
+      <w:proofErr w:type="spellEnd"/>
+      <w:r>
+        <w:rPr>
+          <w:rFonts w:ascii="Times New Roman" w:hAnsi="Times New Roman" w:cs="Times New Roman"/>
+          <w:b/>
+          <w:bCs/>
+        </w:rPr>
+        <w:t>(</w:t>
+      </w:r>
+      <w:proofErr w:type="gramEnd"/>
+      <w:r>
+        <w:rPr>
+          <w:rFonts w:ascii="Times New Roman" w:hAnsi="Times New Roman" w:cs="Times New Roman"/>
+          <w:b/>
+          <w:bCs/>
+        </w:rPr>
+        <w:t>“&lt;key name&gt;”)</w:t>
       </w:r>
     </w:p>
     <w:p>
@@ -1349,13 +1433,23 @@
         </w:rPr>
         <w:t xml:space="preserve">For Clear local storage: </w:t>
       </w:r>
-      <w:r>
-        <w:rPr>
-          <w:rFonts w:ascii="Times New Roman" w:hAnsi="Times New Roman" w:cs="Times New Roman"/>
-          <w:b/>
-          <w:bCs/>
-        </w:rPr>
-        <w:t>clear()</w:t>
+      <w:proofErr w:type="gramStart"/>
+      <w:r>
+        <w:rPr>
+          <w:rFonts w:ascii="Times New Roman" w:hAnsi="Times New Roman" w:cs="Times New Roman"/>
+          <w:b/>
+          <w:bCs/>
+        </w:rPr>
+        <w:t>clear(</w:t>
+      </w:r>
+      <w:proofErr w:type="gramEnd"/>
+      <w:r>
+        <w:rPr>
+          <w:rFonts w:ascii="Times New Roman" w:hAnsi="Times New Roman" w:cs="Times New Roman"/>
+          <w:b/>
+          <w:bCs/>
+        </w:rPr>
+        <w:t>)</w:t>
       </w:r>
     </w:p>
     <w:p>
@@ -1744,13 +1838,41 @@
           <w:bCs/>
         </w:rPr>
       </w:pPr>
-      <w:r>
-        <w:rPr>
-          <w:rFonts w:ascii="Times New Roman" w:hAnsi="Times New Roman" w:cs="Times New Roman"/>
-          <w:b/>
-          <w:bCs/>
-        </w:rPr>
-        <w:t>JSON.stringify(&lt;obj nam</w:t>
+      <w:proofErr w:type="spellStart"/>
+      <w:r>
+        <w:rPr>
+          <w:rFonts w:ascii="Times New Roman" w:hAnsi="Times New Roman" w:cs="Times New Roman"/>
+          <w:b/>
+          <w:bCs/>
+        </w:rPr>
+        <w:t>JSON.stringify</w:t>
+      </w:r>
+      <w:proofErr w:type="spellEnd"/>
+      <w:r>
+        <w:rPr>
+          <w:rFonts w:ascii="Times New Roman" w:hAnsi="Times New Roman" w:cs="Times New Roman"/>
+          <w:b/>
+          <w:bCs/>
+        </w:rPr>
+        <w:t>(&lt;</w:t>
+      </w:r>
+      <w:proofErr w:type="spellStart"/>
+      <w:r>
+        <w:rPr>
+          <w:rFonts w:ascii="Times New Roman" w:hAnsi="Times New Roman" w:cs="Times New Roman"/>
+          <w:b/>
+          <w:bCs/>
+        </w:rPr>
+        <w:t>obj</w:t>
+      </w:r>
+      <w:proofErr w:type="spellEnd"/>
+      <w:r>
+        <w:rPr>
+          <w:rFonts w:ascii="Times New Roman" w:hAnsi="Times New Roman" w:cs="Times New Roman"/>
+          <w:b/>
+          <w:bCs/>
+        </w:rPr>
+        <w:t xml:space="preserve"> nam</w:t>
       </w:r>
       <w:r>
         <w:rPr>
@@ -2130,6 +2252,8 @@
           <w:bCs/>
         </w:rPr>
       </w:pPr>
+      <w:proofErr w:type="spellStart"/>
+      <w:proofErr w:type="gramStart"/>
       <w:r>
         <w:rPr>
           <w:rFonts w:ascii="Times New Roman" w:hAnsi="Times New Roman" w:cs="Times New Roman"/>
@@ -2146,6 +2270,8 @@
         </w:rPr>
         <w:t>ocument.cookie</w:t>
       </w:r>
+      <w:proofErr w:type="spellEnd"/>
+      <w:proofErr w:type="gramEnd"/>
       <w:r>
         <w:rPr>
           <w:rFonts w:ascii="Times New Roman" w:hAnsi="Times New Roman" w:cs="Times New Roman"/>
@@ -2179,7 +2305,21 @@
           <w:rFonts w:ascii="Times New Roman" w:hAnsi="Times New Roman" w:cs="Times New Roman"/>
         </w:rPr>
         <w:lastRenderedPageBreak/>
-        <w:t xml:space="preserve">Cookie sets by web browser using : </w:t>
+        <w:t xml:space="preserve">Cookie sets by web browser </w:t>
+      </w:r>
+      <w:proofErr w:type="gramStart"/>
+      <w:r>
+        <w:rPr>
+          <w:rFonts w:ascii="Times New Roman" w:hAnsi="Times New Roman" w:cs="Times New Roman"/>
+        </w:rPr>
+        <w:t>using :</w:t>
+      </w:r>
+      <w:proofErr w:type="gramEnd"/>
+      <w:r>
+        <w:rPr>
+          <w:rFonts w:ascii="Times New Roman" w:hAnsi="Times New Roman" w:cs="Times New Roman"/>
+        </w:rPr>
+        <w:t xml:space="preserve"> </w:t>
       </w:r>
       <w:r>
         <w:rPr>
@@ -2199,7 +2339,21 @@
         <w:rPr>
           <w:rFonts w:ascii="Times New Roman" w:hAnsi="Times New Roman" w:cs="Times New Roman"/>
         </w:rPr>
-        <w:t>when user visits same webApp second time.</w:t>
+        <w:t xml:space="preserve">when user visits same </w:t>
+      </w:r>
+      <w:proofErr w:type="spellStart"/>
+      <w:r>
+        <w:rPr>
+          <w:rFonts w:ascii="Times New Roman" w:hAnsi="Times New Roman" w:cs="Times New Roman"/>
+        </w:rPr>
+        <w:t>webApp</w:t>
+      </w:r>
+      <w:proofErr w:type="spellEnd"/>
+      <w:r>
+        <w:rPr>
+          <w:rFonts w:ascii="Times New Roman" w:hAnsi="Times New Roman" w:cs="Times New Roman"/>
+        </w:rPr>
+        <w:t xml:space="preserve"> second time.</w:t>
       </w:r>
     </w:p>
     <w:p>
@@ -2243,7 +2397,27 @@
           <w:b/>
           <w:bCs/>
         </w:rPr>
-        <w:t xml:space="preserve">Use: document.cookie() : </w:t>
+        <w:t xml:space="preserve">Use: </w:t>
+      </w:r>
+      <w:proofErr w:type="spellStart"/>
+      <w:proofErr w:type="gramStart"/>
+      <w:r>
+        <w:rPr>
+          <w:rFonts w:ascii="Times New Roman" w:hAnsi="Times New Roman" w:cs="Times New Roman"/>
+          <w:b/>
+          <w:bCs/>
+        </w:rPr>
+        <w:t>document.cookie</w:t>
+      </w:r>
+      <w:proofErr w:type="spellEnd"/>
+      <w:proofErr w:type="gramEnd"/>
+      <w:r>
+        <w:rPr>
+          <w:rFonts w:ascii="Times New Roman" w:hAnsi="Times New Roman" w:cs="Times New Roman"/>
+          <w:b/>
+          <w:bCs/>
+        </w:rPr>
+        <w:t xml:space="preserve">() : </w:t>
       </w:r>
       <w:r>
         <w:rPr>
@@ -2795,6 +2969,7 @@
         </w:rPr>
         <w:t xml:space="preserve"> </w:t>
       </w:r>
+      <w:proofErr w:type="gramStart"/>
       <w:r>
         <w:rPr>
           <w:rFonts w:ascii="Consolas" w:eastAsia="Times New Roman" w:hAnsi="Consolas" w:cs="Times New Roman"/>
@@ -2819,6 +2994,7 @@
         </w:rPr>
         <w:t>(</w:t>
       </w:r>
+      <w:proofErr w:type="gramEnd"/>
       <w:r>
         <w:rPr>
           <w:rFonts w:ascii="Consolas" w:eastAsia="Times New Roman" w:hAnsi="Consolas" w:cs="Times New Roman"/>
@@ -2930,6 +3106,7 @@
         </w:rPr>
         <w:t xml:space="preserve"> </w:t>
       </w:r>
+      <w:proofErr w:type="gramStart"/>
       <w:r>
         <w:rPr>
           <w:rFonts w:ascii="Consolas" w:eastAsia="Times New Roman" w:hAnsi="Consolas" w:cs="Times New Roman"/>
@@ -2954,6 +3131,7 @@
         </w:rPr>
         <w:t>(</w:t>
       </w:r>
+      <w:proofErr w:type="gramEnd"/>
       <w:r>
         <w:rPr>
           <w:rFonts w:ascii="Consolas" w:eastAsia="Times New Roman" w:hAnsi="Consolas" w:cs="Times New Roman"/>
@@ -2993,6 +3171,8 @@
           <w14:ligatures w14:val="none"/>
         </w:rPr>
       </w:pPr>
+      <w:proofErr w:type="spellStart"/>
+      <w:proofErr w:type="gramStart"/>
       <w:r>
         <w:rPr>
           <w:rFonts w:ascii="Consolas" w:eastAsia="Times New Roman" w:hAnsi="Consolas" w:cs="Times New Roman"/>
@@ -3029,6 +3209,8 @@
         </w:rPr>
         <w:t>cookie</w:t>
       </w:r>
+      <w:proofErr w:type="spellEnd"/>
+      <w:proofErr w:type="gramEnd"/>
       <w:r>
         <w:rPr>
           <w:rFonts w:ascii="Consolas" w:eastAsia="Times New Roman" w:hAnsi="Consolas" w:cs="Times New Roman"/>
@@ -3355,6 +3537,7 @@
         </w:rPr>
         <w:t xml:space="preserve"> </w:t>
       </w:r>
+      <w:proofErr w:type="gramStart"/>
       <w:r>
         <w:rPr>
           <w:rFonts w:ascii="Consolas" w:eastAsia="Times New Roman" w:hAnsi="Consolas" w:cs="Times New Roman"/>
@@ -3379,6 +3562,7 @@
         </w:rPr>
         <w:t>(</w:t>
       </w:r>
+      <w:proofErr w:type="gramEnd"/>
       <w:r>
         <w:rPr>
           <w:rFonts w:ascii="Consolas" w:eastAsia="Times New Roman" w:hAnsi="Consolas" w:cs="Times New Roman"/>
@@ -3490,6 +3674,7 @@
         </w:rPr>
         <w:t xml:space="preserve"> </w:t>
       </w:r>
+      <w:proofErr w:type="gramStart"/>
       <w:r>
         <w:rPr>
           <w:rFonts w:ascii="Consolas" w:eastAsia="Times New Roman" w:hAnsi="Consolas" w:cs="Times New Roman"/>
@@ -3514,6 +3699,7 @@
         </w:rPr>
         <w:t>(</w:t>
       </w:r>
+      <w:proofErr w:type="gramEnd"/>
       <w:r>
         <w:rPr>
           <w:rFonts w:ascii="Consolas" w:eastAsia="Times New Roman" w:hAnsi="Consolas" w:cs="Times New Roman"/>
@@ -3563,7 +3749,35 @@
           <w:lang w:eastAsia="en-IN" w:bidi="gu-IN"/>
           <w14:ligatures w14:val="none"/>
         </w:rPr>
-        <w:t>// document.cookie = key + "=" + value;</w:t>
+        <w:t xml:space="preserve">// </w:t>
+      </w:r>
+      <w:proofErr w:type="spellStart"/>
+      <w:proofErr w:type="gramStart"/>
+      <w:r>
+        <w:rPr>
+          <w:rFonts w:ascii="Consolas" w:eastAsia="Times New Roman" w:hAnsi="Consolas" w:cs="Times New Roman"/>
+          <w:color w:val="7F848E"/>
+          <w:kern w:val="0"/>
+          <w:sz w:val="21"/>
+          <w:szCs w:val="21"/>
+          <w:lang w:eastAsia="en-IN" w:bidi="gu-IN"/>
+          <w14:ligatures w14:val="none"/>
+        </w:rPr>
+        <w:t>document.cookie</w:t>
+      </w:r>
+      <w:proofErr w:type="spellEnd"/>
+      <w:proofErr w:type="gramEnd"/>
+      <w:r>
+        <w:rPr>
+          <w:rFonts w:ascii="Consolas" w:eastAsia="Times New Roman" w:hAnsi="Consolas" w:cs="Times New Roman"/>
+          <w:color w:val="7F848E"/>
+          <w:kern w:val="0"/>
+          <w:sz w:val="21"/>
+          <w:szCs w:val="21"/>
+          <w:lang w:eastAsia="en-IN" w:bidi="gu-IN"/>
+          <w14:ligatures w14:val="none"/>
+        </w:rPr>
+        <w:t xml:space="preserve"> = key + "=" + value;</w:t>
       </w:r>
     </w:p>
     <w:p>
@@ -3605,7 +3819,47 @@
           <w:lang w:eastAsia="en-IN" w:bidi="gu-IN"/>
           <w14:ligatures w14:val="none"/>
         </w:rPr>
-        <w:t>// encodeURIComponent() : encode value of cookies key-value before store cookie, For improve security</w:t>
+        <w:t xml:space="preserve">// </w:t>
+      </w:r>
+      <w:proofErr w:type="spellStart"/>
+      <w:proofErr w:type="gramStart"/>
+      <w:r>
+        <w:rPr>
+          <w:rFonts w:ascii="Consolas" w:eastAsia="Times New Roman" w:hAnsi="Consolas" w:cs="Times New Roman"/>
+          <w:color w:val="7F848E"/>
+          <w:kern w:val="0"/>
+          <w:sz w:val="21"/>
+          <w:szCs w:val="21"/>
+          <w:lang w:eastAsia="en-IN" w:bidi="gu-IN"/>
+          <w14:ligatures w14:val="none"/>
+        </w:rPr>
+        <w:t>encodeURIComponent</w:t>
+      </w:r>
+      <w:proofErr w:type="spellEnd"/>
+      <w:r>
+        <w:rPr>
+          <w:rFonts w:ascii="Consolas" w:eastAsia="Times New Roman" w:hAnsi="Consolas" w:cs="Times New Roman"/>
+          <w:color w:val="7F848E"/>
+          <w:kern w:val="0"/>
+          <w:sz w:val="21"/>
+          <w:szCs w:val="21"/>
+          <w:lang w:eastAsia="en-IN" w:bidi="gu-IN"/>
+          <w14:ligatures w14:val="none"/>
+        </w:rPr>
+        <w:t>(</w:t>
+      </w:r>
+      <w:proofErr w:type="gramEnd"/>
+      <w:r>
+        <w:rPr>
+          <w:rFonts w:ascii="Consolas" w:eastAsia="Times New Roman" w:hAnsi="Consolas" w:cs="Times New Roman"/>
+          <w:color w:val="7F848E"/>
+          <w:kern w:val="0"/>
+          <w:sz w:val="21"/>
+          <w:szCs w:val="21"/>
+          <w:lang w:eastAsia="en-IN" w:bidi="gu-IN"/>
+          <w14:ligatures w14:val="none"/>
+        </w:rPr>
+        <w:t>) : encode value of cookies key-value before store cookie, For improve security</w:t>
       </w:r>
     </w:p>
     <w:p>
@@ -3632,7 +3886,47 @@
           <w:lang w:eastAsia="en-IN" w:bidi="gu-IN"/>
           <w14:ligatures w14:val="none"/>
         </w:rPr>
-        <w:t>// decodeURIComponent() : decode value of cookies key-value after store</w:t>
+        <w:t xml:space="preserve">// </w:t>
+      </w:r>
+      <w:proofErr w:type="spellStart"/>
+      <w:proofErr w:type="gramStart"/>
+      <w:r>
+        <w:rPr>
+          <w:rFonts w:ascii="Consolas" w:eastAsia="Times New Roman" w:hAnsi="Consolas" w:cs="Times New Roman"/>
+          <w:color w:val="7F848E"/>
+          <w:kern w:val="0"/>
+          <w:sz w:val="21"/>
+          <w:szCs w:val="21"/>
+          <w:lang w:eastAsia="en-IN" w:bidi="gu-IN"/>
+          <w14:ligatures w14:val="none"/>
+        </w:rPr>
+        <w:t>decodeURIComponent</w:t>
+      </w:r>
+      <w:proofErr w:type="spellEnd"/>
+      <w:r>
+        <w:rPr>
+          <w:rFonts w:ascii="Consolas" w:eastAsia="Times New Roman" w:hAnsi="Consolas" w:cs="Times New Roman"/>
+          <w:color w:val="7F848E"/>
+          <w:kern w:val="0"/>
+          <w:sz w:val="21"/>
+          <w:szCs w:val="21"/>
+          <w:lang w:eastAsia="en-IN" w:bidi="gu-IN"/>
+          <w14:ligatures w14:val="none"/>
+        </w:rPr>
+        <w:t>(</w:t>
+      </w:r>
+      <w:proofErr w:type="gramEnd"/>
+      <w:r>
+        <w:rPr>
+          <w:rFonts w:ascii="Consolas" w:eastAsia="Times New Roman" w:hAnsi="Consolas" w:cs="Times New Roman"/>
+          <w:color w:val="7F848E"/>
+          <w:kern w:val="0"/>
+          <w:sz w:val="21"/>
+          <w:szCs w:val="21"/>
+          <w:lang w:eastAsia="en-IN" w:bidi="gu-IN"/>
+          <w14:ligatures w14:val="none"/>
+        </w:rPr>
+        <w:t>) : decode value of cookies key-value after store</w:t>
       </w:r>
     </w:p>
     <w:p>
@@ -3676,6 +3970,8 @@
           <w14:ligatures w14:val="none"/>
         </w:rPr>
       </w:pPr>
+      <w:proofErr w:type="spellStart"/>
+      <w:proofErr w:type="gramStart"/>
       <w:r>
         <w:rPr>
           <w:rFonts w:ascii="Consolas" w:eastAsia="Times New Roman" w:hAnsi="Consolas" w:cs="Times New Roman"/>
@@ -3712,6 +4008,8 @@
         </w:rPr>
         <w:t>cookie</w:t>
       </w:r>
+      <w:proofErr w:type="spellEnd"/>
+      <w:proofErr w:type="gramEnd"/>
       <w:r>
         <w:rPr>
           <w:rFonts w:ascii="Consolas" w:eastAsia="Times New Roman" w:hAnsi="Consolas" w:cs="Times New Roman"/>
@@ -3772,6 +4070,7 @@
         </w:rPr>
         <w:t>${</w:t>
       </w:r>
+      <w:proofErr w:type="spellStart"/>
       <w:r>
         <w:rPr>
           <w:rFonts w:ascii="Consolas" w:eastAsia="Times New Roman" w:hAnsi="Consolas" w:cs="Times New Roman"/>
@@ -3784,6 +4083,7 @@
         </w:rPr>
         <w:t>encodeURIComponent</w:t>
       </w:r>
+      <w:proofErr w:type="spellEnd"/>
       <w:r>
         <w:rPr>
           <w:rFonts w:ascii="Consolas" w:eastAsia="Times New Roman" w:hAnsi="Consolas" w:cs="Times New Roman"/>
@@ -3856,6 +4156,7 @@
         </w:rPr>
         <w:t>${</w:t>
       </w:r>
+      <w:proofErr w:type="spellStart"/>
       <w:r>
         <w:rPr>
           <w:rFonts w:ascii="Consolas" w:eastAsia="Times New Roman" w:hAnsi="Consolas" w:cs="Times New Roman"/>
@@ -3868,6 +4169,7 @@
         </w:rPr>
         <w:t>encodeURIComponent</w:t>
       </w:r>
+      <w:proofErr w:type="spellEnd"/>
       <w:r>
         <w:rPr>
           <w:rFonts w:ascii="Consolas" w:eastAsia="Times New Roman" w:hAnsi="Consolas" w:cs="Times New Roman"/>
@@ -4045,6 +4347,8 @@
         </w:rPr>
         <w:t>(</w:t>
       </w:r>
+      <w:proofErr w:type="spellStart"/>
+      <w:proofErr w:type="gramStart"/>
       <w:r>
         <w:rPr>
           <w:rFonts w:ascii="Consolas" w:eastAsia="Times New Roman" w:hAnsi="Consolas" w:cs="Times New Roman"/>
@@ -4081,6 +4385,8 @@
         </w:rPr>
         <w:t>cookie</w:t>
       </w:r>
+      <w:proofErr w:type="spellEnd"/>
+      <w:proofErr w:type="gramEnd"/>
       <w:r>
         <w:rPr>
           <w:rFonts w:ascii="Consolas" w:eastAsia="Times New Roman" w:hAnsi="Consolas" w:cs="Times New Roman"/>
@@ -4250,6 +4556,8 @@
           <w14:ligatures w14:val="none"/>
         </w:rPr>
       </w:pPr>
+      <w:proofErr w:type="spellStart"/>
+      <w:proofErr w:type="gramStart"/>
       <w:r>
         <w:rPr>
           <w:rFonts w:ascii="Consolas" w:eastAsia="Times New Roman" w:hAnsi="Consolas" w:cs="Times New Roman"/>
@@ -4287,6 +4595,8 @@
         </w:rPr>
         <w:t>cookie</w:t>
       </w:r>
+      <w:proofErr w:type="spellEnd"/>
+      <w:proofErr w:type="gramEnd"/>
       <w:r>
         <w:rPr>
           <w:rFonts w:ascii="Consolas" w:eastAsia="Times New Roman" w:hAnsi="Consolas" w:cs="Times New Roman"/>
@@ -4333,7 +4643,59 @@
           <w:lang w:eastAsia="en-IN" w:bidi="gu-IN"/>
           <w14:ligatures w14:val="none"/>
         </w:rPr>
-        <w:t>"UserName = Nahii; expires=Sat, 19 Oct 2024 09:35:00 GMT"</w:t>
+        <w:t>"</w:t>
+      </w:r>
+      <w:proofErr w:type="spellStart"/>
+      <w:r>
+        <w:rPr>
+          <w:rFonts w:ascii="Consolas" w:eastAsia="Times New Roman" w:hAnsi="Consolas" w:cs="Times New Roman"/>
+          <w:color w:val="98C379"/>
+          <w:kern w:val="0"/>
+          <w:sz w:val="21"/>
+          <w:szCs w:val="21"/>
+          <w:lang w:eastAsia="en-IN" w:bidi="gu-IN"/>
+          <w14:ligatures w14:val="none"/>
+        </w:rPr>
+        <w:t>UserName</w:t>
+      </w:r>
+      <w:proofErr w:type="spellEnd"/>
+      <w:r>
+        <w:rPr>
+          <w:rFonts w:ascii="Consolas" w:eastAsia="Times New Roman" w:hAnsi="Consolas" w:cs="Times New Roman"/>
+          <w:color w:val="98C379"/>
+          <w:kern w:val="0"/>
+          <w:sz w:val="21"/>
+          <w:szCs w:val="21"/>
+          <w:lang w:eastAsia="en-IN" w:bidi="gu-IN"/>
+          <w14:ligatures w14:val="none"/>
+        </w:rPr>
+        <w:t xml:space="preserve"> = </w:t>
+      </w:r>
+      <w:proofErr w:type="spellStart"/>
+      <w:r>
+        <w:rPr>
+          <w:rFonts w:ascii="Consolas" w:eastAsia="Times New Roman" w:hAnsi="Consolas" w:cs="Times New Roman"/>
+          <w:color w:val="98C379"/>
+          <w:kern w:val="0"/>
+          <w:sz w:val="21"/>
+          <w:szCs w:val="21"/>
+          <w:lang w:eastAsia="en-IN" w:bidi="gu-IN"/>
+          <w14:ligatures w14:val="none"/>
+        </w:rPr>
+        <w:t>Nahii</w:t>
+      </w:r>
+      <w:proofErr w:type="spellEnd"/>
+      <w:r>
+        <w:rPr>
+          <w:rFonts w:ascii="Consolas" w:eastAsia="Times New Roman" w:hAnsi="Consolas" w:cs="Times New Roman"/>
+          <w:color w:val="98C379"/>
+          <w:kern w:val="0"/>
+          <w:sz w:val="21"/>
+          <w:szCs w:val="21"/>
+          <w:lang w:eastAsia="en-IN" w:bidi="gu-IN"/>
+          <w14:ligatures w14:val="none"/>
+        </w:rPr>
+        <w:t>; expires=Sat, 19 Oct 2024 09:35:00 GMT"</w:t>
       </w:r>
       <w:r>
         <w:rPr>
@@ -4742,8 +5104,16 @@
         <w:rPr>
           <w:rFonts w:ascii="Times New Roman" w:hAnsi="Times New Roman" w:cs="Times New Roman"/>
         </w:rPr>
-        <w:t>Caching == Memosation</w:t>
-      </w:r>
+        <w:t xml:space="preserve">Caching == </w:t>
+      </w:r>
+      <w:proofErr w:type="spellStart"/>
+      <w:r>
+        <w:rPr>
+          <w:rFonts w:ascii="Times New Roman" w:hAnsi="Times New Roman" w:cs="Times New Roman"/>
+        </w:rPr>
+        <w:t>Memosation</w:t>
+      </w:r>
+      <w:proofErr w:type="spellEnd"/>
     </w:p>
     <w:p>
       <w:pPr>
@@ -5304,13 +5674,23 @@
           <w:rFonts w:ascii="Times New Roman" w:hAnsi="Times New Roman" w:cs="Times New Roman"/>
         </w:rPr>
       </w:pPr>
-      <w:r>
-        <w:rPr>
-          <w:rFonts w:ascii="Times New Roman" w:hAnsi="Times New Roman" w:cs="Times New Roman"/>
-          <w:b/>
-          <w:bCs/>
-        </w:rPr>
-        <w:t xml:space="preserve">SystaxError: </w:t>
+      <w:proofErr w:type="spellStart"/>
+      <w:r>
+        <w:rPr>
+          <w:rFonts w:ascii="Times New Roman" w:hAnsi="Times New Roman" w:cs="Times New Roman"/>
+          <w:b/>
+          <w:bCs/>
+        </w:rPr>
+        <w:t>SystaxError</w:t>
+      </w:r>
+      <w:proofErr w:type="spellEnd"/>
+      <w:r>
+        <w:rPr>
+          <w:rFonts w:ascii="Times New Roman" w:hAnsi="Times New Roman" w:cs="Times New Roman"/>
+          <w:b/>
+          <w:bCs/>
+        </w:rPr>
+        <w:t xml:space="preserve">: </w:t>
       </w:r>
       <w:r>
         <w:rPr>
@@ -5423,7 +5803,7 @@
         <w:rPr>
           <w:rFonts w:ascii="Times New Roman" w:hAnsi="Times New Roman" w:cs="Times New Roman"/>
         </w:rPr>
-        <w:t>For create private fields and methods we use : #</w:t>
+        <w:t>For create private fields and methods we use: #</w:t>
       </w:r>
     </w:p>
     <w:p>
@@ -5443,6 +5823,373 @@
         </w:rPr>
         <w:t>We need to create private properties in initial phase of their declaration.</w:t>
       </w:r>
+    </w:p>
+    <w:p>
+      <w:pPr>
+        <w:pStyle w:val="ListParagraph"/>
+        <w:numPr>
+          <w:ilvl w:val="0"/>
+          <w:numId w:val="2"/>
+        </w:numPr>
+        <w:spacing w:before="100" w:beforeAutospacing="1" w:after="100" w:afterAutospacing="1" w:line="240" w:lineRule="auto"/>
+        <w:outlineLvl w:val="2"/>
+        <w:rPr>
+          <w:rFonts w:ascii="Times New Roman" w:eastAsia="Times New Roman" w:hAnsi="Times New Roman" w:cs="Times New Roman"/>
+          <w:b/>
+          <w:bCs/>
+          <w:kern w:val="0"/>
+          <w:sz w:val="24"/>
+          <w:szCs w:val="24"/>
+          <w:lang w:eastAsia="en-IN" w:bidi="gu-IN"/>
+          <w14:ligatures w14:val="none"/>
+        </w:rPr>
+      </w:pPr>
+      <w:r>
+        <w:rPr>
+          <w:rFonts w:ascii="Times New Roman" w:eastAsia="Times New Roman" w:hAnsi="Times New Roman" w:cs="Times New Roman"/>
+          <w:b/>
+          <w:bCs/>
+          <w:kern w:val="0"/>
+          <w:sz w:val="24"/>
+          <w:szCs w:val="24"/>
+          <w:lang w:eastAsia="en-IN" w:bidi="gu-IN"/>
+          <w14:ligatures w14:val="none"/>
+        </w:rPr>
+        <w:lastRenderedPageBreak/>
+        <w:t xml:space="preserve">Callbacks </w:t>
+      </w:r>
+    </w:p>
+    <w:p>
+      <w:pPr>
+        <w:pStyle w:val="ListParagraph"/>
+        <w:numPr>
+          <w:ilvl w:val="1"/>
+          <w:numId w:val="2"/>
+        </w:numPr>
+        <w:spacing w:before="100" w:beforeAutospacing="1" w:after="100" w:afterAutospacing="1" w:line="240" w:lineRule="auto"/>
+        <w:rPr>
+          <w:rFonts w:ascii="Times New Roman" w:eastAsia="Times New Roman" w:hAnsi="Times New Roman" w:cs="Times New Roman"/>
+          <w:kern w:val="0"/>
+          <w:sz w:val="24"/>
+          <w:szCs w:val="24"/>
+          <w:lang w:eastAsia="en-IN" w:bidi="gu-IN"/>
+          <w14:ligatures w14:val="none"/>
+        </w:rPr>
+      </w:pPr>
+      <w:r>
+        <w:rPr>
+          <w:rFonts w:ascii="Times New Roman" w:eastAsia="Times New Roman" w:hAnsi="Times New Roman" w:cs="Times New Roman"/>
+          <w:kern w:val="0"/>
+          <w:sz w:val="24"/>
+          <w:szCs w:val="24"/>
+          <w:lang w:eastAsia="en-IN" w:bidi="gu-IN"/>
+          <w14:ligatures w14:val="none"/>
+        </w:rPr>
+        <w:t xml:space="preserve">A </w:t>
+      </w:r>
+      <w:r>
+        <w:rPr>
+          <w:rFonts w:ascii="Times New Roman" w:eastAsia="Times New Roman" w:hAnsi="Times New Roman" w:cs="Times New Roman"/>
+          <w:b/>
+          <w:bCs/>
+          <w:kern w:val="0"/>
+          <w:sz w:val="24"/>
+          <w:szCs w:val="24"/>
+          <w:lang w:eastAsia="en-IN" w:bidi="gu-IN"/>
+          <w14:ligatures w14:val="none"/>
+        </w:rPr>
+        <w:t>callback</w:t>
+      </w:r>
+      <w:r>
+        <w:rPr>
+          <w:rFonts w:ascii="Times New Roman" w:eastAsia="Times New Roman" w:hAnsi="Times New Roman" w:cs="Times New Roman"/>
+          <w:kern w:val="0"/>
+          <w:sz w:val="24"/>
+          <w:szCs w:val="24"/>
+          <w:lang w:eastAsia="en-IN" w:bidi="gu-IN"/>
+          <w14:ligatures w14:val="none"/>
+        </w:rPr>
+        <w:t xml:space="preserve"> is a function that is passed as an argument to another function and is executed after that function completes. It allows asynchronous </w:t>
+      </w:r>
+      <w:r>
+        <w:rPr>
+          <w:rFonts w:ascii="Times New Roman" w:eastAsia="Times New Roman" w:hAnsi="Times New Roman" w:cs="Times New Roman"/>
+          <w:kern w:val="0"/>
+          <w:sz w:val="24"/>
+          <w:szCs w:val="24"/>
+          <w:lang w:eastAsia="en-IN" w:bidi="gu-IN"/>
+          <w14:ligatures w14:val="none"/>
+        </w:rPr>
+        <w:t>behaviour</w:t>
+      </w:r>
+      <w:r>
+        <w:rPr>
+          <w:rFonts w:ascii="Times New Roman" w:eastAsia="Times New Roman" w:hAnsi="Times New Roman" w:cs="Times New Roman"/>
+          <w:kern w:val="0"/>
+          <w:sz w:val="24"/>
+          <w:szCs w:val="24"/>
+          <w:lang w:eastAsia="en-IN" w:bidi="gu-IN"/>
+          <w14:ligatures w14:val="none"/>
+        </w:rPr>
+        <w:t>, where code can continue executing while waiting for a particular task to finish</w:t>
+      </w:r>
+      <w:r>
+        <w:rPr>
+          <w:rFonts w:ascii="Times New Roman" w:eastAsia="Times New Roman" w:hAnsi="Times New Roman" w:cs="Times New Roman"/>
+          <w:kern w:val="0"/>
+          <w:sz w:val="24"/>
+          <w:szCs w:val="24"/>
+          <w:lang w:eastAsia="en-IN" w:bidi="gu-IN"/>
+          <w14:ligatures w14:val="none"/>
+        </w:rPr>
+        <w:t>.</w:t>
+      </w:r>
+    </w:p>
+    <w:p>
+      <w:pPr>
+        <w:pStyle w:val="ListParagraph"/>
+        <w:spacing w:before="100" w:beforeAutospacing="1" w:after="100" w:afterAutospacing="1" w:line="240" w:lineRule="auto"/>
+        <w:ind w:left="1440"/>
+        <w:rPr>
+          <w:rFonts w:ascii="Times New Roman" w:eastAsia="Times New Roman" w:hAnsi="Times New Roman" w:cs="Times New Roman"/>
+          <w:kern w:val="0"/>
+          <w:sz w:val="24"/>
+          <w:szCs w:val="24"/>
+          <w:lang w:eastAsia="en-IN" w:bidi="gu-IN"/>
+          <w14:ligatures w14:val="none"/>
+        </w:rPr>
+      </w:pPr>
+    </w:p>
+    <w:p>
+      <w:pPr>
+        <w:pStyle w:val="ListParagraph"/>
+        <w:numPr>
+          <w:ilvl w:val="0"/>
+          <w:numId w:val="2"/>
+        </w:numPr>
+        <w:spacing w:before="100" w:beforeAutospacing="1" w:after="100" w:afterAutospacing="1" w:line="240" w:lineRule="auto"/>
+        <w:rPr>
+          <w:rFonts w:ascii="Times New Roman" w:eastAsia="Times New Roman" w:hAnsi="Times New Roman" w:cs="Times New Roman"/>
+          <w:b/>
+          <w:bCs/>
+          <w:kern w:val="0"/>
+          <w:sz w:val="24"/>
+          <w:szCs w:val="24"/>
+          <w:lang w:eastAsia="en-IN" w:bidi="gu-IN"/>
+          <w14:ligatures w14:val="none"/>
+        </w:rPr>
+      </w:pPr>
+      <w:r>
+        <w:rPr>
+          <w:rFonts w:ascii="Times New Roman" w:eastAsia="Times New Roman" w:hAnsi="Times New Roman" w:cs="Times New Roman"/>
+          <w:b/>
+          <w:bCs/>
+          <w:kern w:val="0"/>
+          <w:sz w:val="24"/>
+          <w:szCs w:val="24"/>
+          <w:lang w:eastAsia="en-IN" w:bidi="gu-IN"/>
+          <w14:ligatures w14:val="none"/>
+        </w:rPr>
+        <w:t>Issues with callback</w:t>
+      </w:r>
+    </w:p>
+    <w:p>
+      <w:pPr>
+        <w:pStyle w:val="ListParagraph"/>
+        <w:spacing w:before="100" w:beforeAutospacing="1" w:after="100" w:afterAutospacing="1" w:line="240" w:lineRule="auto"/>
+        <w:rPr>
+          <w:rFonts w:ascii="Times New Roman" w:eastAsia="Times New Roman" w:hAnsi="Times New Roman" w:cs="Times New Roman"/>
+          <w:b/>
+          <w:bCs/>
+          <w:kern w:val="0"/>
+          <w:sz w:val="24"/>
+          <w:szCs w:val="24"/>
+          <w:lang w:eastAsia="en-IN" w:bidi="gu-IN"/>
+          <w14:ligatures w14:val="none"/>
+        </w:rPr>
+      </w:pPr>
+    </w:p>
+    <w:p>
+      <w:pPr>
+        <w:pStyle w:val="ListParagraph"/>
+        <w:numPr>
+          <w:ilvl w:val="1"/>
+          <w:numId w:val="2"/>
+        </w:numPr>
+        <w:spacing w:before="100" w:beforeAutospacing="1" w:after="100" w:afterAutospacing="1" w:line="240" w:lineRule="auto"/>
+        <w:rPr>
+          <w:rFonts w:ascii="Times New Roman" w:eastAsia="Times New Roman" w:hAnsi="Times New Roman" w:cs="Times New Roman"/>
+          <w:b/>
+          <w:bCs/>
+          <w:kern w:val="0"/>
+          <w:sz w:val="24"/>
+          <w:szCs w:val="24"/>
+          <w:lang w:eastAsia="en-IN" w:bidi="gu-IN"/>
+          <w14:ligatures w14:val="none"/>
+        </w:rPr>
+      </w:pPr>
+      <w:r>
+        <w:rPr>
+          <w:rStyle w:val="Strong"/>
+          <w:rFonts w:ascii="Times New Roman" w:hAnsi="Times New Roman" w:cs="Times New Roman"/>
+          <w:sz w:val="24"/>
+          <w:szCs w:val="24"/>
+        </w:rPr>
+        <w:t>Callback Hell</w:t>
+      </w:r>
+    </w:p>
+    <w:p>
+      <w:pPr>
+        <w:pStyle w:val="NormalWeb"/>
+        <w:numPr>
+          <w:ilvl w:val="1"/>
+          <w:numId w:val="2"/>
+        </w:numPr>
+        <w:ind w:left="1800"/>
+      </w:pPr>
+      <w:r>
+        <w:t>Callback hell occurs when multiple asynchronous functions are nested inside each other in such a way that the code becomes difficult to read and maintain. It happens when you need to perform multiple asynchronous operations one after the other, and each operation depends on the result of the previous one.</w:t>
+      </w:r>
+    </w:p>
+    <w:p>
+      <w:pPr>
+        <w:pStyle w:val="NormalWeb"/>
+        <w:ind w:left="1800"/>
+      </w:pPr>
+    </w:p>
+    <w:p>
+      <w:pPr>
+        <w:pStyle w:val="Heading3"/>
+        <w:numPr>
+          <w:ilvl w:val="1"/>
+          <w:numId w:val="2"/>
+        </w:numPr>
+      </w:pPr>
+      <w:r>
+        <w:rPr>
+          <w:rStyle w:val="Strong"/>
+          <w:b/>
+          <w:bCs/>
+        </w:rPr>
+        <w:t>I</w:t>
+      </w:r>
+      <w:r>
+        <w:rPr>
+          <w:rStyle w:val="Strong"/>
+          <w:b/>
+          <w:bCs/>
+        </w:rPr>
+        <w:t>nversion of Control (IoC) in JavaScript</w:t>
+      </w:r>
+    </w:p>
+    <w:p>
+      <w:pPr>
+        <w:pStyle w:val="NormalWeb"/>
+        <w:numPr>
+          <w:ilvl w:val="1"/>
+          <w:numId w:val="2"/>
+        </w:numPr>
+        <w:ind w:left="1800"/>
+      </w:pPr>
+      <w:r>
+        <w:t xml:space="preserve">Inversion of Control (IoC) refers to a design principle where the control of flow (or logic) is reversed compared to traditional procedural programming. In simpler terms, instead of a calling function directly dictating what happens step-by-step, control is passed to an external function, framework, or library. This principle is often used with </w:t>
+      </w:r>
+      <w:r>
+        <w:rPr>
+          <w:rStyle w:val="Strong"/>
+        </w:rPr>
+        <w:t>callbacks</w:t>
+      </w:r>
+      <w:r>
+        <w:t xml:space="preserve">, </w:t>
+      </w:r>
+      <w:r>
+        <w:rPr>
+          <w:rStyle w:val="Strong"/>
+        </w:rPr>
+        <w:t>event listeners</w:t>
+      </w:r>
+      <w:r>
+        <w:t xml:space="preserve">, </w:t>
+      </w:r>
+      <w:r>
+        <w:rPr>
+          <w:rStyle w:val="Strong"/>
+        </w:rPr>
+        <w:t>dependency injection</w:t>
+      </w:r>
+      <w:r>
+        <w:t xml:space="preserve">, and </w:t>
+      </w:r>
+      <w:r>
+        <w:rPr>
+          <w:rStyle w:val="Strong"/>
+        </w:rPr>
+        <w:t>frameworks</w:t>
+      </w:r>
+      <w:r>
+        <w:t>.</w:t>
+      </w:r>
+    </w:p>
+    <w:p>
+      <w:pPr>
+        <w:pStyle w:val="NormalWeb"/>
+        <w:ind w:left="1800"/>
+      </w:pPr>
+    </w:p>
+    <w:p>
+      <w:pPr>
+        <w:pStyle w:val="NormalWeb"/>
+        <w:numPr>
+          <w:ilvl w:val="1"/>
+          <w:numId w:val="2"/>
+        </w:numPr>
+        <w:ind w:left="1800"/>
+      </w:pPr>
+      <w:r>
+        <w:rPr>
+          <w:rStyle w:val="Strong"/>
+          <w:b w:val="0"/>
+          <w:bCs w:val="0"/>
+          <w:color w:val="000000" w:themeColor="text1"/>
+        </w:rPr>
+        <w:t>Callback Example and IoC:</w:t>
+      </w:r>
+    </w:p>
+    <w:p>
+      <w:pPr>
+        <w:pStyle w:val="NormalWeb"/>
+        <w:numPr>
+          <w:ilvl w:val="2"/>
+          <w:numId w:val="2"/>
+        </w:numPr>
+        <w:ind w:left="2520"/>
+      </w:pPr>
+      <w:r>
+        <w:t xml:space="preserve">In JavaScript, </w:t>
+      </w:r>
+      <w:r>
+        <w:rPr>
+          <w:rStyle w:val="Strong"/>
+        </w:rPr>
+        <w:t>callbacks</w:t>
+      </w:r>
+      <w:r>
+        <w:t xml:space="preserve"> introduce a form of IoC because we pass the control of a function to another function, typically provided by the environment (like the browser or Node.js). The callback function's execution is no longer directly under the control of the original calling code.</w:t>
+      </w:r>
+    </w:p>
+    <w:p>
+      <w:pPr>
+        <w:spacing w:before="100" w:beforeAutospacing="1" w:after="100" w:afterAutospacing="1" w:line="240" w:lineRule="auto"/>
+        <w:rPr>
+          <w:rFonts w:ascii="Times New Roman" w:eastAsia="Times New Roman" w:hAnsi="Times New Roman" w:cs="Times New Roman"/>
+          <w:kern w:val="0"/>
+          <w:sz w:val="24"/>
+          <w:szCs w:val="24"/>
+          <w:lang w:eastAsia="en-IN" w:bidi="gu-IN"/>
+          <w14:ligatures w14:val="none"/>
+        </w:rPr>
+      </w:pPr>
     </w:p>
     <w:sectPr>
       <w:pgSz w:w="11906" w:h="16838"/>
@@ -6185,7 +6932,7 @@
   <w:abstractNum w:abstractNumId="6" w15:restartNumberingAfterBreak="0">
     <w:nsid w:val="4CBD3718"/>
     <w:multiLevelType w:val="multilevel"/>
-    <w:tmpl w:val="1A6E4A1A"/>
+    <w:tmpl w:val="9276239E"/>
     <w:lvl w:ilvl="0">
       <w:start w:val="1"/>
       <w:numFmt w:val="bullet"/>
@@ -6241,20 +6988,16 @@
         <w:sz w:val="20"/>
       </w:rPr>
     </w:lvl>
-    <w:lvl w:ilvl="4" w:tentative="1">
+    <w:lvl w:ilvl="4">
       <w:start w:val="1"/>
-      <w:numFmt w:val="bullet"/>
-      <w:lvlText w:val=""/>
+      <w:numFmt w:val="decimal"/>
+      <w:lvlText w:val="%5)"/>
       <w:lvlJc w:val="left"/>
       <w:pPr>
-        <w:tabs>
-          <w:tab w:val="num" w:pos="3600"/>
-        </w:tabs>
         <w:ind w:left="3600" w:hanging="360"/>
       </w:pPr>
       <w:rPr>
-        <w:rFonts w:ascii="Wingdings" w:hAnsi="Wingdings" w:hint="default"/>
-        <w:sz w:val="20"/>
+        <w:rFonts w:hint="default"/>
       </w:rPr>
     </w:lvl>
     <w:lvl w:ilvl="5" w:tentative="1">
@@ -7020,6 +7763,51 @@
     <w:qFormat/>
     <w:rsid w:val="00E81F6C"/>
   </w:style>
+  <w:style w:type="paragraph" w:styleId="Heading3">
+    <w:name w:val="heading 3"/>
+    <w:basedOn w:val="Normal"/>
+    <w:link w:val="Heading3Char"/>
+    <w:uiPriority w:val="9"/>
+    <w:qFormat/>
+    <w:rsid w:val="003A0B72"/>
+    <w:pPr>
+      <w:spacing w:before="100" w:beforeAutospacing="1" w:after="100" w:afterAutospacing="1" w:line="240" w:lineRule="auto"/>
+      <w:outlineLvl w:val="2"/>
+    </w:pPr>
+    <w:rPr>
+      <w:rFonts w:ascii="Times New Roman" w:eastAsia="Times New Roman" w:hAnsi="Times New Roman" w:cs="Times New Roman"/>
+      <w:b/>
+      <w:bCs/>
+      <w:kern w:val="0"/>
+      <w:sz w:val="27"/>
+      <w:szCs w:val="27"/>
+      <w:lang w:eastAsia="en-IN" w:bidi="gu-IN"/>
+      <w14:ligatures w14:val="none"/>
+    </w:rPr>
+  </w:style>
+  <w:style w:type="paragraph" w:styleId="Heading4">
+    <w:name w:val="heading 4"/>
+    <w:basedOn w:val="Normal"/>
+    <w:next w:val="Normal"/>
+    <w:link w:val="Heading4Char"/>
+    <w:uiPriority w:val="9"/>
+    <w:semiHidden/>
+    <w:unhideWhenUsed/>
+    <w:qFormat/>
+    <w:rsid w:val="0098330B"/>
+    <w:pPr>
+      <w:keepNext/>
+      <w:keepLines/>
+      <w:spacing w:before="40" w:after="0"/>
+      <w:outlineLvl w:val="3"/>
+    </w:pPr>
+    <w:rPr>
+      <w:rFonts w:asciiTheme="majorHAnsi" w:eastAsiaTheme="majorEastAsia" w:hAnsiTheme="majorHAnsi" w:cstheme="majorBidi"/>
+      <w:i/>
+      <w:iCs/>
+      <w:color w:val="2F5496" w:themeColor="accent1" w:themeShade="BF"/>
+    </w:rPr>
+  </w:style>
   <w:style w:type="character" w:default="1" w:styleId="DefaultParagraphFont">
     <w:name w:val="Default Paragraph Font"/>
     <w:uiPriority w:val="1"/>
@@ -7090,6 +7878,66 @@
     <w:rPr>
       <w:color w:val="954F72" w:themeColor="followedHyperlink"/>
       <w:u w:val="single"/>
+    </w:rPr>
+  </w:style>
+  <w:style w:type="character" w:customStyle="1" w:styleId="Heading3Char">
+    <w:name w:val="Heading 3 Char"/>
+    <w:basedOn w:val="DefaultParagraphFont"/>
+    <w:link w:val="Heading3"/>
+    <w:uiPriority w:val="9"/>
+    <w:rsid w:val="003A0B72"/>
+    <w:rPr>
+      <w:rFonts w:ascii="Times New Roman" w:eastAsia="Times New Roman" w:hAnsi="Times New Roman" w:cs="Times New Roman"/>
+      <w:b/>
+      <w:bCs/>
+      <w:kern w:val="0"/>
+      <w:sz w:val="27"/>
+      <w:szCs w:val="27"/>
+      <w:lang w:eastAsia="en-IN" w:bidi="gu-IN"/>
+      <w14:ligatures w14:val="none"/>
+    </w:rPr>
+  </w:style>
+  <w:style w:type="character" w:styleId="Strong">
+    <w:name w:val="Strong"/>
+    <w:basedOn w:val="DefaultParagraphFont"/>
+    <w:uiPriority w:val="22"/>
+    <w:qFormat/>
+    <w:rsid w:val="003A0B72"/>
+    <w:rPr>
+      <w:b/>
+      <w:bCs/>
+    </w:rPr>
+  </w:style>
+  <w:style w:type="paragraph" w:styleId="NormalWeb">
+    <w:name w:val="Normal (Web)"/>
+    <w:basedOn w:val="Normal"/>
+    <w:uiPriority w:val="99"/>
+    <w:unhideWhenUsed/>
+    <w:rsid w:val="003A0B72"/>
+    <w:pPr>
+      <w:spacing w:before="100" w:beforeAutospacing="1" w:after="100" w:afterAutospacing="1" w:line="240" w:lineRule="auto"/>
+    </w:pPr>
+    <w:rPr>
+      <w:rFonts w:ascii="Times New Roman" w:eastAsia="Times New Roman" w:hAnsi="Times New Roman" w:cs="Times New Roman"/>
+      <w:kern w:val="0"/>
+      <w:sz w:val="24"/>
+      <w:szCs w:val="24"/>
+      <w:lang w:eastAsia="en-IN" w:bidi="gu-IN"/>
+      <w14:ligatures w14:val="none"/>
+    </w:rPr>
+  </w:style>
+  <w:style w:type="character" w:customStyle="1" w:styleId="Heading4Char">
+    <w:name w:val="Heading 4 Char"/>
+    <w:basedOn w:val="DefaultParagraphFont"/>
+    <w:link w:val="Heading4"/>
+    <w:uiPriority w:val="9"/>
+    <w:semiHidden/>
+    <w:rsid w:val="0098330B"/>
+    <w:rPr>
+      <w:rFonts w:asciiTheme="majorHAnsi" w:eastAsiaTheme="majorEastAsia" w:hAnsiTheme="majorHAnsi" w:cstheme="majorBidi"/>
+      <w:i/>
+      <w:iCs/>
+      <w:color w:val="2F5496" w:themeColor="accent1" w:themeShade="BF"/>
     </w:rPr>
   </w:style>
 </w:styles>

</xml_diff>

<commit_message>
basic of async await
</commit_message>
<xml_diff>
--- a/AdvJS/Local Storage.docx
+++ b/AdvJS/Local Storage.docx
@@ -2,6 +2,24 @@
 <file path=word/document.xml><?xml version="1.0" encoding="utf-8"?>
 <w:document xmlns:wpc="http://schemas.microsoft.com/office/word/2010/wordprocessingCanvas" xmlns:cx="http://schemas.microsoft.com/office/drawing/2014/chartex" xmlns:cx1="http://schemas.microsoft.com/office/drawing/2015/9/8/chartex" xmlns:cx2="http://schemas.microsoft.com/office/drawing/2015/10/21/chartex" xmlns:cx3="http://schemas.microsoft.com/office/drawing/2016/5/9/chartex" xmlns:cx4="http://schemas.microsoft.com/office/drawing/2016/5/10/chartex" xmlns:cx5="http://schemas.microsoft.com/office/drawing/2016/5/11/chartex" xmlns:cx6="http://schemas.microsoft.com/office/drawing/2016/5/12/chartex" xmlns:cx7="http://schemas.microsoft.com/office/drawing/2016/5/13/chartex" xmlns:cx8="http://schemas.microsoft.com/office/drawing/2016/5/14/chartex" xmlns:mc="http://schemas.openxmlformats.org/markup-compatibility/2006" xmlns:aink="http://schemas.microsoft.com/office/drawing/2016/ink" xmlns:am3d="http://schemas.microsoft.com/office/drawing/2017/model3d" xmlns:o="urn:schemas-microsoft-com:office:office" xmlns:oel="http://schemas.microsoft.com/office/2019/extlst" xmlns:r="http://schemas.openxmlformats.org/officeDocument/2006/relationships" xmlns:m="http://schemas.openxmlformats.org/officeDocument/2006/math" xmlns:v="urn:schemas-microsoft-com:vml" xmlns:wp14="http://schemas.microsoft.com/office/word/2010/wordprocessingDrawing" xmlns:wp="http://schemas.openxmlformats.org/drawingml/2006/wordprocessingDrawing" xmlns:w10="urn:schemas-microsoft-com:office:word" xmlns:w="http://schemas.openxmlformats.org/wordprocessingml/2006/main" xmlns:w14="http://schemas.microsoft.com/office/word/2010/wordml" xmlns:w15="http://schemas.microsoft.com/office/word/2012/wordml" xmlns:w16cex="http://schemas.microsoft.com/office/word/2018/wordml/cex" xmlns:w16cid="http://schemas.microsoft.com/office/word/2016/wordml/cid" xmlns:w16="http://schemas.microsoft.com/office/word/2018/wordml" xmlns:w16du="http://schemas.microsoft.com/office/word/2023/wordml/word16du" xmlns:w16sdtdh="http://schemas.microsoft.com/office/word/2020/wordml/sdtdatahash" xmlns:w16se="http://schemas.microsoft.com/office/word/2015/wordml/symex" xmlns:wpg="http://schemas.microsoft.com/office/word/2010/wordprocessingGroup" xmlns:wpi="http://schemas.microsoft.com/office/word/2010/wordprocessingInk" xmlns:wne="http://schemas.microsoft.com/office/word/2006/wordml" xmlns:wps="http://schemas.microsoft.com/office/word/2010/wordprocessingShape" mc:Ignorable="w14 w15 w16se w16cid w16 w16cex w16sdtdh w16du wp14">
   <w:body>
+    <w:p>
+      <w:pPr>
+        <w:rPr>
+          <w:rFonts w:ascii="Times New Roman" w:hAnsi="Times New Roman" w:cs="Times New Roman"/>
+          <w:b/>
+          <w:bCs/>
+        </w:rPr>
+      </w:pPr>
+    </w:p>
+    <w:p>
+      <w:pPr>
+        <w:rPr>
+          <w:rFonts w:ascii="Times New Roman" w:hAnsi="Times New Roman" w:cs="Times New Roman"/>
+          <w:b/>
+          <w:bCs/>
+        </w:rPr>
+      </w:pPr>
+    </w:p>
     <w:p>
       <w:pPr>
         <w:rPr>
@@ -433,6 +451,7 @@
         <w:rPr>
           <w:rFonts w:ascii="Times New Roman" w:hAnsi="Times New Roman" w:cs="Times New Roman"/>
         </w:rPr>
+        <w:lastRenderedPageBreak/>
         <w:t>Why we use Session storage?</w:t>
       </w:r>
     </w:p>
@@ -451,7 +470,6 @@
         <w:rPr>
           <w:rFonts w:ascii="Times New Roman" w:hAnsi="Times New Roman" w:cs="Times New Roman"/>
         </w:rPr>
-        <w:lastRenderedPageBreak/>
         <w:t>For</w:t>
       </w:r>
       <w:r>
@@ -514,21 +532,11 @@
         </w:rPr>
         <w:t xml:space="preserve"> </w:t>
       </w:r>
-      <w:proofErr w:type="spellStart"/>
-      <w:proofErr w:type="gramStart"/>
-      <w:r>
-        <w:rPr>
-          <w:rFonts w:ascii="Times New Roman" w:hAnsi="Times New Roman" w:cs="Times New Roman"/>
-        </w:rPr>
-        <w:t>session.addEventListener</w:t>
-      </w:r>
-      <w:proofErr w:type="spellEnd"/>
-      <w:proofErr w:type="gramEnd"/>
-      <w:r>
-        <w:rPr>
-          <w:rFonts w:ascii="Times New Roman" w:hAnsi="Times New Roman" w:cs="Times New Roman"/>
-        </w:rPr>
-        <w:t>() etc.</w:t>
+      <w:r>
+        <w:rPr>
+          <w:rFonts w:ascii="Times New Roman" w:hAnsi="Times New Roman" w:cs="Times New Roman"/>
+        </w:rPr>
+        <w:t>session.addEventListener() etc.</w:t>
       </w:r>
     </w:p>
     <w:p>
@@ -986,35 +994,15 @@
           <w:b/>
           <w:bCs/>
         </w:rPr>
-        <w:t xml:space="preserve">e: </w:t>
-      </w:r>
-      <w:proofErr w:type="spellStart"/>
-      <w:proofErr w:type="gramStart"/>
-      <w:r>
-        <w:rPr>
-          <w:rFonts w:ascii="Times New Roman" w:hAnsi="Times New Roman" w:cs="Times New Roman"/>
-          <w:b/>
-          <w:bCs/>
-        </w:rPr>
-        <w:t>setItem</w:t>
-      </w:r>
-      <w:proofErr w:type="spellEnd"/>
-      <w:r>
-        <w:rPr>
-          <w:rFonts w:ascii="Times New Roman" w:hAnsi="Times New Roman" w:cs="Times New Roman"/>
-          <w:b/>
-          <w:bCs/>
-        </w:rPr>
-        <w:t>(</w:t>
-      </w:r>
-      <w:proofErr w:type="gramEnd"/>
-      <w:r>
-        <w:rPr>
-          <w:rFonts w:ascii="Times New Roman" w:hAnsi="Times New Roman" w:cs="Times New Roman"/>
-          <w:b/>
-          <w:bCs/>
-        </w:rPr>
-        <w:t>)</w:t>
+        <w:t>e: setItem</w:t>
+      </w:r>
+      <w:r>
+        <w:rPr>
+          <w:rFonts w:ascii="Times New Roman" w:hAnsi="Times New Roman" w:cs="Times New Roman"/>
+          <w:b/>
+          <w:bCs/>
+        </w:rPr>
+        <w:t>()</w:t>
       </w:r>
     </w:p>
     <w:p>
@@ -1032,29 +1020,7 @@
         <w:rPr>
           <w:rFonts w:ascii="Times New Roman" w:hAnsi="Times New Roman" w:cs="Times New Roman"/>
         </w:rPr>
-        <w:t xml:space="preserve">It must have 2 </w:t>
-      </w:r>
-      <w:proofErr w:type="spellStart"/>
-      <w:proofErr w:type="gramStart"/>
-      <w:r>
-        <w:rPr>
-          <w:rFonts w:ascii="Times New Roman" w:hAnsi="Times New Roman" w:cs="Times New Roman"/>
-        </w:rPr>
-        <w:t>args</w:t>
-      </w:r>
-      <w:proofErr w:type="spellEnd"/>
-      <w:r>
-        <w:rPr>
-          <w:rFonts w:ascii="Times New Roman" w:hAnsi="Times New Roman" w:cs="Times New Roman"/>
-        </w:rPr>
-        <w:t>(</w:t>
-      </w:r>
-      <w:proofErr w:type="gramEnd"/>
-      <w:r>
-        <w:rPr>
-          <w:rFonts w:ascii="Times New Roman" w:hAnsi="Times New Roman" w:cs="Times New Roman"/>
-        </w:rPr>
-        <w:t>key, value), o/w it will give ERROR.</w:t>
+        <w:t>It must have 2 args(key, value), o/w it will give ERROR.</w:t>
       </w:r>
     </w:p>
     <w:p>
@@ -1122,8 +1088,6 @@
         </w:rPr>
         <w:t xml:space="preserve">For fetch/access data from local storage: </w:t>
       </w:r>
-      <w:proofErr w:type="spellStart"/>
-      <w:proofErr w:type="gramStart"/>
       <w:r>
         <w:rPr>
           <w:rFonts w:ascii="Times New Roman" w:hAnsi="Times New Roman" w:cs="Times New Roman"/>
@@ -1132,23 +1096,13 @@
         </w:rPr>
         <w:t>getItem</w:t>
       </w:r>
-      <w:proofErr w:type="spellEnd"/>
-      <w:r>
-        <w:rPr>
-          <w:rFonts w:ascii="Times New Roman" w:hAnsi="Times New Roman" w:cs="Times New Roman"/>
-          <w:b/>
-          <w:bCs/>
-        </w:rPr>
-        <w:t>(</w:t>
-      </w:r>
-      <w:proofErr w:type="gramEnd"/>
-      <w:r>
-        <w:rPr>
-          <w:rFonts w:ascii="Times New Roman" w:hAnsi="Times New Roman" w:cs="Times New Roman"/>
-          <w:b/>
-          <w:bCs/>
-        </w:rPr>
-        <w:t>“&lt;key name&gt;”)</w:t>
+      <w:r>
+        <w:rPr>
+          <w:rFonts w:ascii="Times New Roman" w:hAnsi="Times New Roman" w:cs="Times New Roman"/>
+          <w:b/>
+          <w:bCs/>
+        </w:rPr>
+        <w:t>(“&lt;key name&gt;”)</w:t>
       </w:r>
     </w:p>
     <w:p>
@@ -1338,33 +1292,13 @@
         </w:rPr>
         <w:t xml:space="preserve">For remove particular data from local storage using key value: </w:t>
       </w:r>
-      <w:proofErr w:type="spellStart"/>
-      <w:proofErr w:type="gramStart"/>
-      <w:r>
-        <w:rPr>
-          <w:rFonts w:ascii="Times New Roman" w:hAnsi="Times New Roman" w:cs="Times New Roman"/>
-          <w:b/>
-          <w:bCs/>
-        </w:rPr>
-        <w:t>removeItem</w:t>
-      </w:r>
-      <w:proofErr w:type="spellEnd"/>
-      <w:r>
-        <w:rPr>
-          <w:rFonts w:ascii="Times New Roman" w:hAnsi="Times New Roman" w:cs="Times New Roman"/>
-          <w:b/>
-          <w:bCs/>
-        </w:rPr>
-        <w:t>(</w:t>
-      </w:r>
-      <w:proofErr w:type="gramEnd"/>
-      <w:r>
-        <w:rPr>
-          <w:rFonts w:ascii="Times New Roman" w:hAnsi="Times New Roman" w:cs="Times New Roman"/>
-          <w:b/>
-          <w:bCs/>
-        </w:rPr>
-        <w:t>“&lt;key name&gt;”)</w:t>
+      <w:r>
+        <w:rPr>
+          <w:rFonts w:ascii="Times New Roman" w:hAnsi="Times New Roman" w:cs="Times New Roman"/>
+          <w:b/>
+          <w:bCs/>
+        </w:rPr>
+        <w:t>removeItem(“&lt;key name&gt;”)</w:t>
       </w:r>
     </w:p>
     <w:p>
@@ -1433,23 +1367,13 @@
         </w:rPr>
         <w:t xml:space="preserve">For Clear local storage: </w:t>
       </w:r>
-      <w:proofErr w:type="gramStart"/>
-      <w:r>
-        <w:rPr>
-          <w:rFonts w:ascii="Times New Roman" w:hAnsi="Times New Roman" w:cs="Times New Roman"/>
-          <w:b/>
-          <w:bCs/>
-        </w:rPr>
-        <w:t>clear(</w:t>
-      </w:r>
-      <w:proofErr w:type="gramEnd"/>
-      <w:r>
-        <w:rPr>
-          <w:rFonts w:ascii="Times New Roman" w:hAnsi="Times New Roman" w:cs="Times New Roman"/>
-          <w:b/>
-          <w:bCs/>
-        </w:rPr>
-        <w:t>)</w:t>
+      <w:r>
+        <w:rPr>
+          <w:rFonts w:ascii="Times New Roman" w:hAnsi="Times New Roman" w:cs="Times New Roman"/>
+          <w:b/>
+          <w:bCs/>
+        </w:rPr>
+        <w:t>clear()</w:t>
       </w:r>
     </w:p>
     <w:p>
@@ -1838,41 +1762,13 @@
           <w:bCs/>
         </w:rPr>
       </w:pPr>
-      <w:proofErr w:type="spellStart"/>
-      <w:r>
-        <w:rPr>
-          <w:rFonts w:ascii="Times New Roman" w:hAnsi="Times New Roman" w:cs="Times New Roman"/>
-          <w:b/>
-          <w:bCs/>
-        </w:rPr>
-        <w:t>JSON.stringify</w:t>
-      </w:r>
-      <w:proofErr w:type="spellEnd"/>
-      <w:r>
-        <w:rPr>
-          <w:rFonts w:ascii="Times New Roman" w:hAnsi="Times New Roman" w:cs="Times New Roman"/>
-          <w:b/>
-          <w:bCs/>
-        </w:rPr>
-        <w:t>(&lt;</w:t>
-      </w:r>
-      <w:proofErr w:type="spellStart"/>
-      <w:r>
-        <w:rPr>
-          <w:rFonts w:ascii="Times New Roman" w:hAnsi="Times New Roman" w:cs="Times New Roman"/>
-          <w:b/>
-          <w:bCs/>
-        </w:rPr>
-        <w:t>obj</w:t>
-      </w:r>
-      <w:proofErr w:type="spellEnd"/>
-      <w:r>
-        <w:rPr>
-          <w:rFonts w:ascii="Times New Roman" w:hAnsi="Times New Roman" w:cs="Times New Roman"/>
-          <w:b/>
-          <w:bCs/>
-        </w:rPr>
-        <w:t xml:space="preserve"> nam</w:t>
+      <w:r>
+        <w:rPr>
+          <w:rFonts w:ascii="Times New Roman" w:hAnsi="Times New Roman" w:cs="Times New Roman"/>
+          <w:b/>
+          <w:bCs/>
+        </w:rPr>
+        <w:t>JSON.stringify(&lt;obj nam</w:t>
       </w:r>
       <w:r>
         <w:rPr>
@@ -2252,8 +2148,6 @@
           <w:bCs/>
         </w:rPr>
       </w:pPr>
-      <w:proofErr w:type="spellStart"/>
-      <w:proofErr w:type="gramStart"/>
       <w:r>
         <w:rPr>
           <w:rFonts w:ascii="Times New Roman" w:hAnsi="Times New Roman" w:cs="Times New Roman"/>
@@ -2270,8 +2164,6 @@
         </w:rPr>
         <w:t>ocument.cookie</w:t>
       </w:r>
-      <w:proofErr w:type="spellEnd"/>
-      <w:proofErr w:type="gramEnd"/>
       <w:r>
         <w:rPr>
           <w:rFonts w:ascii="Times New Roman" w:hAnsi="Times New Roman" w:cs="Times New Roman"/>
@@ -2305,21 +2197,7 @@
           <w:rFonts w:ascii="Times New Roman" w:hAnsi="Times New Roman" w:cs="Times New Roman"/>
         </w:rPr>
         <w:lastRenderedPageBreak/>
-        <w:t xml:space="preserve">Cookie sets by web browser </w:t>
-      </w:r>
-      <w:proofErr w:type="gramStart"/>
-      <w:r>
-        <w:rPr>
-          <w:rFonts w:ascii="Times New Roman" w:hAnsi="Times New Roman" w:cs="Times New Roman"/>
-        </w:rPr>
-        <w:t>using :</w:t>
-      </w:r>
-      <w:proofErr w:type="gramEnd"/>
-      <w:r>
-        <w:rPr>
-          <w:rFonts w:ascii="Times New Roman" w:hAnsi="Times New Roman" w:cs="Times New Roman"/>
-        </w:rPr>
-        <w:t xml:space="preserve"> </w:t>
+        <w:t xml:space="preserve">Cookie sets by web browser using : </w:t>
       </w:r>
       <w:r>
         <w:rPr>
@@ -2339,21 +2217,7 @@
         <w:rPr>
           <w:rFonts w:ascii="Times New Roman" w:hAnsi="Times New Roman" w:cs="Times New Roman"/>
         </w:rPr>
-        <w:t xml:space="preserve">when user visits same </w:t>
-      </w:r>
-      <w:proofErr w:type="spellStart"/>
-      <w:r>
-        <w:rPr>
-          <w:rFonts w:ascii="Times New Roman" w:hAnsi="Times New Roman" w:cs="Times New Roman"/>
-        </w:rPr>
-        <w:t>webApp</w:t>
-      </w:r>
-      <w:proofErr w:type="spellEnd"/>
-      <w:r>
-        <w:rPr>
-          <w:rFonts w:ascii="Times New Roman" w:hAnsi="Times New Roman" w:cs="Times New Roman"/>
-        </w:rPr>
-        <w:t xml:space="preserve"> second time.</w:t>
+        <w:t>when user visits same webApp second time.</w:t>
       </w:r>
     </w:p>
     <w:p>
@@ -2397,27 +2261,7 @@
           <w:b/>
           <w:bCs/>
         </w:rPr>
-        <w:t xml:space="preserve">Use: </w:t>
-      </w:r>
-      <w:proofErr w:type="spellStart"/>
-      <w:proofErr w:type="gramStart"/>
-      <w:r>
-        <w:rPr>
-          <w:rFonts w:ascii="Times New Roman" w:hAnsi="Times New Roman" w:cs="Times New Roman"/>
-          <w:b/>
-          <w:bCs/>
-        </w:rPr>
-        <w:t>document.cookie</w:t>
-      </w:r>
-      <w:proofErr w:type="spellEnd"/>
-      <w:proofErr w:type="gramEnd"/>
-      <w:r>
-        <w:rPr>
-          <w:rFonts w:ascii="Times New Roman" w:hAnsi="Times New Roman" w:cs="Times New Roman"/>
-          <w:b/>
-          <w:bCs/>
-        </w:rPr>
-        <w:t xml:space="preserve">() : </w:t>
+        <w:t xml:space="preserve">Use: document.cookie() : </w:t>
       </w:r>
       <w:r>
         <w:rPr>
@@ -2969,7 +2813,6 @@
         </w:rPr>
         <w:t xml:space="preserve"> </w:t>
       </w:r>
-      <w:proofErr w:type="gramStart"/>
       <w:r>
         <w:rPr>
           <w:rFonts w:ascii="Consolas" w:eastAsia="Times New Roman" w:hAnsi="Consolas" w:cs="Times New Roman"/>
@@ -2994,7 +2837,6 @@
         </w:rPr>
         <w:t>(</w:t>
       </w:r>
-      <w:proofErr w:type="gramEnd"/>
       <w:r>
         <w:rPr>
           <w:rFonts w:ascii="Consolas" w:eastAsia="Times New Roman" w:hAnsi="Consolas" w:cs="Times New Roman"/>
@@ -3106,7 +2948,6 @@
         </w:rPr>
         <w:t xml:space="preserve"> </w:t>
       </w:r>
-      <w:proofErr w:type="gramStart"/>
       <w:r>
         <w:rPr>
           <w:rFonts w:ascii="Consolas" w:eastAsia="Times New Roman" w:hAnsi="Consolas" w:cs="Times New Roman"/>
@@ -3131,7 +2972,6 @@
         </w:rPr>
         <w:t>(</w:t>
       </w:r>
-      <w:proofErr w:type="gramEnd"/>
       <w:r>
         <w:rPr>
           <w:rFonts w:ascii="Consolas" w:eastAsia="Times New Roman" w:hAnsi="Consolas" w:cs="Times New Roman"/>
@@ -3171,8 +3011,6 @@
           <w14:ligatures w14:val="none"/>
         </w:rPr>
       </w:pPr>
-      <w:proofErr w:type="spellStart"/>
-      <w:proofErr w:type="gramStart"/>
       <w:r>
         <w:rPr>
           <w:rFonts w:ascii="Consolas" w:eastAsia="Times New Roman" w:hAnsi="Consolas" w:cs="Times New Roman"/>
@@ -3209,8 +3047,6 @@
         </w:rPr>
         <w:t>cookie</w:t>
       </w:r>
-      <w:proofErr w:type="spellEnd"/>
-      <w:proofErr w:type="gramEnd"/>
       <w:r>
         <w:rPr>
           <w:rFonts w:ascii="Consolas" w:eastAsia="Times New Roman" w:hAnsi="Consolas" w:cs="Times New Roman"/>
@@ -3537,7 +3373,6 @@
         </w:rPr>
         <w:t xml:space="preserve"> </w:t>
       </w:r>
-      <w:proofErr w:type="gramStart"/>
       <w:r>
         <w:rPr>
           <w:rFonts w:ascii="Consolas" w:eastAsia="Times New Roman" w:hAnsi="Consolas" w:cs="Times New Roman"/>
@@ -3562,7 +3397,6 @@
         </w:rPr>
         <w:t>(</w:t>
       </w:r>
-      <w:proofErr w:type="gramEnd"/>
       <w:r>
         <w:rPr>
           <w:rFonts w:ascii="Consolas" w:eastAsia="Times New Roman" w:hAnsi="Consolas" w:cs="Times New Roman"/>
@@ -3674,7 +3508,6 @@
         </w:rPr>
         <w:t xml:space="preserve"> </w:t>
       </w:r>
-      <w:proofErr w:type="gramStart"/>
       <w:r>
         <w:rPr>
           <w:rFonts w:ascii="Consolas" w:eastAsia="Times New Roman" w:hAnsi="Consolas" w:cs="Times New Roman"/>
@@ -3699,7 +3532,6 @@
         </w:rPr>
         <w:t>(</w:t>
       </w:r>
-      <w:proofErr w:type="gramEnd"/>
       <w:r>
         <w:rPr>
           <w:rFonts w:ascii="Consolas" w:eastAsia="Times New Roman" w:hAnsi="Consolas" w:cs="Times New Roman"/>
@@ -3749,35 +3581,7 @@
           <w:lang w:eastAsia="en-IN" w:bidi="gu-IN"/>
           <w14:ligatures w14:val="none"/>
         </w:rPr>
-        <w:t xml:space="preserve">// </w:t>
-      </w:r>
-      <w:proofErr w:type="spellStart"/>
-      <w:proofErr w:type="gramStart"/>
-      <w:r>
-        <w:rPr>
-          <w:rFonts w:ascii="Consolas" w:eastAsia="Times New Roman" w:hAnsi="Consolas" w:cs="Times New Roman"/>
-          <w:color w:val="7F848E"/>
-          <w:kern w:val="0"/>
-          <w:sz w:val="21"/>
-          <w:szCs w:val="21"/>
-          <w:lang w:eastAsia="en-IN" w:bidi="gu-IN"/>
-          <w14:ligatures w14:val="none"/>
-        </w:rPr>
-        <w:t>document.cookie</w:t>
-      </w:r>
-      <w:proofErr w:type="spellEnd"/>
-      <w:proofErr w:type="gramEnd"/>
-      <w:r>
-        <w:rPr>
-          <w:rFonts w:ascii="Consolas" w:eastAsia="Times New Roman" w:hAnsi="Consolas" w:cs="Times New Roman"/>
-          <w:color w:val="7F848E"/>
-          <w:kern w:val="0"/>
-          <w:sz w:val="21"/>
-          <w:szCs w:val="21"/>
-          <w:lang w:eastAsia="en-IN" w:bidi="gu-IN"/>
-          <w14:ligatures w14:val="none"/>
-        </w:rPr>
-        <w:t xml:space="preserve"> = key + "=" + value;</w:t>
+        <w:t>// document.cookie = key + "=" + value;</w:t>
       </w:r>
     </w:p>
     <w:p>
@@ -3819,47 +3623,7 @@
           <w:lang w:eastAsia="en-IN" w:bidi="gu-IN"/>
           <w14:ligatures w14:val="none"/>
         </w:rPr>
-        <w:t xml:space="preserve">// </w:t>
-      </w:r>
-      <w:proofErr w:type="spellStart"/>
-      <w:proofErr w:type="gramStart"/>
-      <w:r>
-        <w:rPr>
-          <w:rFonts w:ascii="Consolas" w:eastAsia="Times New Roman" w:hAnsi="Consolas" w:cs="Times New Roman"/>
-          <w:color w:val="7F848E"/>
-          <w:kern w:val="0"/>
-          <w:sz w:val="21"/>
-          <w:szCs w:val="21"/>
-          <w:lang w:eastAsia="en-IN" w:bidi="gu-IN"/>
-          <w14:ligatures w14:val="none"/>
-        </w:rPr>
-        <w:t>encodeURIComponent</w:t>
-      </w:r>
-      <w:proofErr w:type="spellEnd"/>
-      <w:r>
-        <w:rPr>
-          <w:rFonts w:ascii="Consolas" w:eastAsia="Times New Roman" w:hAnsi="Consolas" w:cs="Times New Roman"/>
-          <w:color w:val="7F848E"/>
-          <w:kern w:val="0"/>
-          <w:sz w:val="21"/>
-          <w:szCs w:val="21"/>
-          <w:lang w:eastAsia="en-IN" w:bidi="gu-IN"/>
-          <w14:ligatures w14:val="none"/>
-        </w:rPr>
-        <w:t>(</w:t>
-      </w:r>
-      <w:proofErr w:type="gramEnd"/>
-      <w:r>
-        <w:rPr>
-          <w:rFonts w:ascii="Consolas" w:eastAsia="Times New Roman" w:hAnsi="Consolas" w:cs="Times New Roman"/>
-          <w:color w:val="7F848E"/>
-          <w:kern w:val="0"/>
-          <w:sz w:val="21"/>
-          <w:szCs w:val="21"/>
-          <w:lang w:eastAsia="en-IN" w:bidi="gu-IN"/>
-          <w14:ligatures w14:val="none"/>
-        </w:rPr>
-        <w:t>) : encode value of cookies key-value before store cookie, For improve security</w:t>
+        <w:t>// encodeURIComponent() : encode value of cookies key-value before store cookie, For improve security</w:t>
       </w:r>
     </w:p>
     <w:p>
@@ -3886,47 +3650,7 @@
           <w:lang w:eastAsia="en-IN" w:bidi="gu-IN"/>
           <w14:ligatures w14:val="none"/>
         </w:rPr>
-        <w:t xml:space="preserve">// </w:t>
-      </w:r>
-      <w:proofErr w:type="spellStart"/>
-      <w:proofErr w:type="gramStart"/>
-      <w:r>
-        <w:rPr>
-          <w:rFonts w:ascii="Consolas" w:eastAsia="Times New Roman" w:hAnsi="Consolas" w:cs="Times New Roman"/>
-          <w:color w:val="7F848E"/>
-          <w:kern w:val="0"/>
-          <w:sz w:val="21"/>
-          <w:szCs w:val="21"/>
-          <w:lang w:eastAsia="en-IN" w:bidi="gu-IN"/>
-          <w14:ligatures w14:val="none"/>
-        </w:rPr>
-        <w:t>decodeURIComponent</w:t>
-      </w:r>
-      <w:proofErr w:type="spellEnd"/>
-      <w:r>
-        <w:rPr>
-          <w:rFonts w:ascii="Consolas" w:eastAsia="Times New Roman" w:hAnsi="Consolas" w:cs="Times New Roman"/>
-          <w:color w:val="7F848E"/>
-          <w:kern w:val="0"/>
-          <w:sz w:val="21"/>
-          <w:szCs w:val="21"/>
-          <w:lang w:eastAsia="en-IN" w:bidi="gu-IN"/>
-          <w14:ligatures w14:val="none"/>
-        </w:rPr>
-        <w:t>(</w:t>
-      </w:r>
-      <w:proofErr w:type="gramEnd"/>
-      <w:r>
-        <w:rPr>
-          <w:rFonts w:ascii="Consolas" w:eastAsia="Times New Roman" w:hAnsi="Consolas" w:cs="Times New Roman"/>
-          <w:color w:val="7F848E"/>
-          <w:kern w:val="0"/>
-          <w:sz w:val="21"/>
-          <w:szCs w:val="21"/>
-          <w:lang w:eastAsia="en-IN" w:bidi="gu-IN"/>
-          <w14:ligatures w14:val="none"/>
-        </w:rPr>
-        <w:t>) : decode value of cookies key-value after store</w:t>
+        <w:t>// decodeURIComponent() : decode value of cookies key-value after store</w:t>
       </w:r>
     </w:p>
     <w:p>
@@ -3970,8 +3694,6 @@
           <w14:ligatures w14:val="none"/>
         </w:rPr>
       </w:pPr>
-      <w:proofErr w:type="spellStart"/>
-      <w:proofErr w:type="gramStart"/>
       <w:r>
         <w:rPr>
           <w:rFonts w:ascii="Consolas" w:eastAsia="Times New Roman" w:hAnsi="Consolas" w:cs="Times New Roman"/>
@@ -4008,8 +3730,6 @@
         </w:rPr>
         <w:t>cookie</w:t>
       </w:r>
-      <w:proofErr w:type="spellEnd"/>
-      <w:proofErr w:type="gramEnd"/>
       <w:r>
         <w:rPr>
           <w:rFonts w:ascii="Consolas" w:eastAsia="Times New Roman" w:hAnsi="Consolas" w:cs="Times New Roman"/>
@@ -4070,7 +3790,6 @@
         </w:rPr>
         <w:t>${</w:t>
       </w:r>
-      <w:proofErr w:type="spellStart"/>
       <w:r>
         <w:rPr>
           <w:rFonts w:ascii="Consolas" w:eastAsia="Times New Roman" w:hAnsi="Consolas" w:cs="Times New Roman"/>
@@ -4083,7 +3802,6 @@
         </w:rPr>
         <w:t>encodeURIComponent</w:t>
       </w:r>
-      <w:proofErr w:type="spellEnd"/>
       <w:r>
         <w:rPr>
           <w:rFonts w:ascii="Consolas" w:eastAsia="Times New Roman" w:hAnsi="Consolas" w:cs="Times New Roman"/>
@@ -4156,7 +3874,6 @@
         </w:rPr>
         <w:t>${</w:t>
       </w:r>
-      <w:proofErr w:type="spellStart"/>
       <w:r>
         <w:rPr>
           <w:rFonts w:ascii="Consolas" w:eastAsia="Times New Roman" w:hAnsi="Consolas" w:cs="Times New Roman"/>
@@ -4169,7 +3886,6 @@
         </w:rPr>
         <w:t>encodeURIComponent</w:t>
       </w:r>
-      <w:proofErr w:type="spellEnd"/>
       <w:r>
         <w:rPr>
           <w:rFonts w:ascii="Consolas" w:eastAsia="Times New Roman" w:hAnsi="Consolas" w:cs="Times New Roman"/>
@@ -4347,8 +4063,6 @@
         </w:rPr>
         <w:t>(</w:t>
       </w:r>
-      <w:proofErr w:type="spellStart"/>
-      <w:proofErr w:type="gramStart"/>
       <w:r>
         <w:rPr>
           <w:rFonts w:ascii="Consolas" w:eastAsia="Times New Roman" w:hAnsi="Consolas" w:cs="Times New Roman"/>
@@ -4385,8 +4099,6 @@
         </w:rPr>
         <w:t>cookie</w:t>
       </w:r>
-      <w:proofErr w:type="spellEnd"/>
-      <w:proofErr w:type="gramEnd"/>
       <w:r>
         <w:rPr>
           <w:rFonts w:ascii="Consolas" w:eastAsia="Times New Roman" w:hAnsi="Consolas" w:cs="Times New Roman"/>
@@ -4556,8 +4268,6 @@
           <w14:ligatures w14:val="none"/>
         </w:rPr>
       </w:pPr>
-      <w:proofErr w:type="spellStart"/>
-      <w:proofErr w:type="gramStart"/>
       <w:r>
         <w:rPr>
           <w:rFonts w:ascii="Consolas" w:eastAsia="Times New Roman" w:hAnsi="Consolas" w:cs="Times New Roman"/>
@@ -4595,8 +4305,6 @@
         </w:rPr>
         <w:t>cookie</w:t>
       </w:r>
-      <w:proofErr w:type="spellEnd"/>
-      <w:proofErr w:type="gramEnd"/>
       <w:r>
         <w:rPr>
           <w:rFonts w:ascii="Consolas" w:eastAsia="Times New Roman" w:hAnsi="Consolas" w:cs="Times New Roman"/>
@@ -4643,59 +4351,7 @@
           <w:lang w:eastAsia="en-IN" w:bidi="gu-IN"/>
           <w14:ligatures w14:val="none"/>
         </w:rPr>
-        <w:t>"</w:t>
-      </w:r>
-      <w:proofErr w:type="spellStart"/>
-      <w:r>
-        <w:rPr>
-          <w:rFonts w:ascii="Consolas" w:eastAsia="Times New Roman" w:hAnsi="Consolas" w:cs="Times New Roman"/>
-          <w:color w:val="98C379"/>
-          <w:kern w:val="0"/>
-          <w:sz w:val="21"/>
-          <w:szCs w:val="21"/>
-          <w:lang w:eastAsia="en-IN" w:bidi="gu-IN"/>
-          <w14:ligatures w14:val="none"/>
-        </w:rPr>
-        <w:t>UserName</w:t>
-      </w:r>
-      <w:proofErr w:type="spellEnd"/>
-      <w:r>
-        <w:rPr>
-          <w:rFonts w:ascii="Consolas" w:eastAsia="Times New Roman" w:hAnsi="Consolas" w:cs="Times New Roman"/>
-          <w:color w:val="98C379"/>
-          <w:kern w:val="0"/>
-          <w:sz w:val="21"/>
-          <w:szCs w:val="21"/>
-          <w:lang w:eastAsia="en-IN" w:bidi="gu-IN"/>
-          <w14:ligatures w14:val="none"/>
-        </w:rPr>
-        <w:t xml:space="preserve"> = </w:t>
-      </w:r>
-      <w:proofErr w:type="spellStart"/>
-      <w:r>
-        <w:rPr>
-          <w:rFonts w:ascii="Consolas" w:eastAsia="Times New Roman" w:hAnsi="Consolas" w:cs="Times New Roman"/>
-          <w:color w:val="98C379"/>
-          <w:kern w:val="0"/>
-          <w:sz w:val="21"/>
-          <w:szCs w:val="21"/>
-          <w:lang w:eastAsia="en-IN" w:bidi="gu-IN"/>
-          <w14:ligatures w14:val="none"/>
-        </w:rPr>
-        <w:t>Nahii</w:t>
-      </w:r>
-      <w:proofErr w:type="spellEnd"/>
-      <w:r>
-        <w:rPr>
-          <w:rFonts w:ascii="Consolas" w:eastAsia="Times New Roman" w:hAnsi="Consolas" w:cs="Times New Roman"/>
-          <w:color w:val="98C379"/>
-          <w:kern w:val="0"/>
-          <w:sz w:val="21"/>
-          <w:szCs w:val="21"/>
-          <w:lang w:eastAsia="en-IN" w:bidi="gu-IN"/>
-          <w14:ligatures w14:val="none"/>
-        </w:rPr>
-        <w:t>; expires=Sat, 19 Oct 2024 09:35:00 GMT"</w:t>
+        <w:t>"UserName = Nahii; expires=Sat, 19 Oct 2024 09:35:00 GMT"</w:t>
       </w:r>
       <w:r>
         <w:rPr>
@@ -5104,16 +4760,8 @@
         <w:rPr>
           <w:rFonts w:ascii="Times New Roman" w:hAnsi="Times New Roman" w:cs="Times New Roman"/>
         </w:rPr>
-        <w:t xml:space="preserve">Caching == </w:t>
-      </w:r>
-      <w:proofErr w:type="spellStart"/>
-      <w:r>
-        <w:rPr>
-          <w:rFonts w:ascii="Times New Roman" w:hAnsi="Times New Roman" w:cs="Times New Roman"/>
-        </w:rPr>
-        <w:t>Memosation</w:t>
-      </w:r>
-      <w:proofErr w:type="spellEnd"/>
+        <w:t>Caching == Memosation</w:t>
+      </w:r>
     </w:p>
     <w:p>
       <w:pPr>
@@ -5596,25 +5244,7 @@
             <w:color w:val="000000" w:themeColor="text1"/>
             <w:u w:val="none"/>
           </w:rPr>
-          <w:t xml:space="preserve">strict </w:t>
-        </w:r>
-        <w:r>
-          <w:rPr>
-            <w:rStyle w:val="Hyperlink"/>
-            <w:rFonts w:ascii="Times New Roman" w:hAnsi="Times New Roman" w:cs="Times New Roman"/>
-            <w:color w:val="000000" w:themeColor="text1"/>
-            <w:u w:val="none"/>
-          </w:rPr>
-          <w:t>m</w:t>
-        </w:r>
-        <w:r>
-          <w:rPr>
-            <w:rStyle w:val="Hyperlink"/>
-            <w:rFonts w:ascii="Times New Roman" w:hAnsi="Times New Roman" w:cs="Times New Roman"/>
-            <w:color w:val="000000" w:themeColor="text1"/>
-            <w:u w:val="none"/>
-          </w:rPr>
-          <w:t>ode</w:t>
+          <w:t>strict mode</w:t>
         </w:r>
       </w:hyperlink>
       <w:r>
@@ -5674,23 +5304,13 @@
           <w:rFonts w:ascii="Times New Roman" w:hAnsi="Times New Roman" w:cs="Times New Roman"/>
         </w:rPr>
       </w:pPr>
-      <w:proofErr w:type="spellStart"/>
-      <w:r>
-        <w:rPr>
-          <w:rFonts w:ascii="Times New Roman" w:hAnsi="Times New Roman" w:cs="Times New Roman"/>
-          <w:b/>
-          <w:bCs/>
-        </w:rPr>
-        <w:t>SystaxError</w:t>
-      </w:r>
-      <w:proofErr w:type="spellEnd"/>
-      <w:r>
-        <w:rPr>
-          <w:rFonts w:ascii="Times New Roman" w:hAnsi="Times New Roman" w:cs="Times New Roman"/>
-          <w:b/>
-          <w:bCs/>
-        </w:rPr>
-        <w:t xml:space="preserve">: </w:t>
+      <w:r>
+        <w:rPr>
+          <w:rFonts w:ascii="Times New Roman" w:hAnsi="Times New Roman" w:cs="Times New Roman"/>
+          <w:b/>
+          <w:bCs/>
+        </w:rPr>
+        <w:t xml:space="preserve">SystaxError: </w:t>
       </w:r>
       <w:r>
         <w:rPr>
@@ -5838,8 +5458,6 @@
           <w:b/>
           <w:bCs/>
           <w:kern w:val="0"/>
-          <w:sz w:val="24"/>
-          <w:szCs w:val="24"/>
           <w:lang w:eastAsia="en-IN" w:bidi="gu-IN"/>
           <w14:ligatures w14:val="none"/>
         </w:rPr>
@@ -5850,8 +5468,6 @@
           <w:b/>
           <w:bCs/>
           <w:kern w:val="0"/>
-          <w:sz w:val="24"/>
-          <w:szCs w:val="24"/>
           <w:lang w:eastAsia="en-IN" w:bidi="gu-IN"/>
           <w14:ligatures w14:val="none"/>
         </w:rPr>
@@ -5870,8 +5486,6 @@
         <w:rPr>
           <w:rFonts w:ascii="Times New Roman" w:eastAsia="Times New Roman" w:hAnsi="Times New Roman" w:cs="Times New Roman"/>
           <w:kern w:val="0"/>
-          <w:sz w:val="24"/>
-          <w:szCs w:val="24"/>
           <w:lang w:eastAsia="en-IN" w:bidi="gu-IN"/>
           <w14:ligatures w14:val="none"/>
         </w:rPr>
@@ -5880,8 +5494,6 @@
         <w:rPr>
           <w:rFonts w:ascii="Times New Roman" w:eastAsia="Times New Roman" w:hAnsi="Times New Roman" w:cs="Times New Roman"/>
           <w:kern w:val="0"/>
-          <w:sz w:val="24"/>
-          <w:szCs w:val="24"/>
           <w:lang w:eastAsia="en-IN" w:bidi="gu-IN"/>
           <w14:ligatures w14:val="none"/>
         </w:rPr>
@@ -5893,8 +5505,6 @@
           <w:b/>
           <w:bCs/>
           <w:kern w:val="0"/>
-          <w:sz w:val="24"/>
-          <w:szCs w:val="24"/>
           <w:lang w:eastAsia="en-IN" w:bidi="gu-IN"/>
           <w14:ligatures w14:val="none"/>
         </w:rPr>
@@ -5904,45 +5514,10 @@
         <w:rPr>
           <w:rFonts w:ascii="Times New Roman" w:eastAsia="Times New Roman" w:hAnsi="Times New Roman" w:cs="Times New Roman"/>
           <w:kern w:val="0"/>
-          <w:sz w:val="24"/>
-          <w:szCs w:val="24"/>
-          <w:lang w:eastAsia="en-IN" w:bidi="gu-IN"/>
-          <w14:ligatures w14:val="none"/>
-        </w:rPr>
-        <w:t xml:space="preserve"> is a function that is passed as an argument to another function and is executed after that function completes. It allows asynchronous </w:t>
-      </w:r>
-      <w:r>
-        <w:rPr>
-          <w:rFonts w:ascii="Times New Roman" w:eastAsia="Times New Roman" w:hAnsi="Times New Roman" w:cs="Times New Roman"/>
-          <w:kern w:val="0"/>
-          <w:sz w:val="24"/>
-          <w:szCs w:val="24"/>
-          <w:lang w:eastAsia="en-IN" w:bidi="gu-IN"/>
-          <w14:ligatures w14:val="none"/>
-        </w:rPr>
-        <w:t>behaviour</w:t>
-      </w:r>
-      <w:r>
-        <w:rPr>
-          <w:rFonts w:ascii="Times New Roman" w:eastAsia="Times New Roman" w:hAnsi="Times New Roman" w:cs="Times New Roman"/>
-          <w:kern w:val="0"/>
-          <w:sz w:val="24"/>
-          <w:szCs w:val="24"/>
-          <w:lang w:eastAsia="en-IN" w:bidi="gu-IN"/>
-          <w14:ligatures w14:val="none"/>
-        </w:rPr>
-        <w:t>, where code can continue executing while waiting for a particular task to finish</w:t>
-      </w:r>
-      <w:r>
-        <w:rPr>
-          <w:rFonts w:ascii="Times New Roman" w:eastAsia="Times New Roman" w:hAnsi="Times New Roman" w:cs="Times New Roman"/>
-          <w:kern w:val="0"/>
-          <w:sz w:val="24"/>
-          <w:szCs w:val="24"/>
-          <w:lang w:eastAsia="en-IN" w:bidi="gu-IN"/>
-          <w14:ligatures w14:val="none"/>
-        </w:rPr>
-        <w:t>.</w:t>
+          <w:lang w:eastAsia="en-IN" w:bidi="gu-IN"/>
+          <w14:ligatures w14:val="none"/>
+        </w:rPr>
+        <w:t xml:space="preserve"> is a function that is passed as an argument to another function and is executed after that function completes. It allows asynchronous behaviour, where code can continue executing while waiting for a particular task to finish.</w:t>
       </w:r>
     </w:p>
     <w:p>
@@ -5953,8 +5528,6 @@
         <w:rPr>
           <w:rFonts w:ascii="Times New Roman" w:eastAsia="Times New Roman" w:hAnsi="Times New Roman" w:cs="Times New Roman"/>
           <w:kern w:val="0"/>
-          <w:sz w:val="24"/>
-          <w:szCs w:val="24"/>
           <w:lang w:eastAsia="en-IN" w:bidi="gu-IN"/>
           <w14:ligatures w14:val="none"/>
         </w:rPr>
@@ -5973,8 +5546,6 @@
           <w:b/>
           <w:bCs/>
           <w:kern w:val="0"/>
-          <w:sz w:val="24"/>
-          <w:szCs w:val="24"/>
           <w:lang w:eastAsia="en-IN" w:bidi="gu-IN"/>
           <w14:ligatures w14:val="none"/>
         </w:rPr>
@@ -5985,8 +5556,6 @@
           <w:b/>
           <w:bCs/>
           <w:kern w:val="0"/>
-          <w:sz w:val="24"/>
-          <w:szCs w:val="24"/>
           <w:lang w:eastAsia="en-IN" w:bidi="gu-IN"/>
           <w14:ligatures w14:val="none"/>
         </w:rPr>
@@ -6002,8 +5571,6 @@
           <w:b/>
           <w:bCs/>
           <w:kern w:val="0"/>
-          <w:sz w:val="24"/>
-          <w:szCs w:val="24"/>
           <w:lang w:eastAsia="en-IN" w:bidi="gu-IN"/>
           <w14:ligatures w14:val="none"/>
         </w:rPr>
@@ -6022,8 +5589,6 @@
           <w:b/>
           <w:bCs/>
           <w:kern w:val="0"/>
-          <w:sz w:val="24"/>
-          <w:szCs w:val="24"/>
           <w:lang w:eastAsia="en-IN" w:bidi="gu-IN"/>
           <w14:ligatures w14:val="none"/>
         </w:rPr>
@@ -6032,8 +5597,6 @@
         <w:rPr>
           <w:rStyle w:val="Strong"/>
           <w:rFonts w:ascii="Times New Roman" w:hAnsi="Times New Roman" w:cs="Times New Roman"/>
-          <w:sz w:val="24"/>
-          <w:szCs w:val="24"/>
         </w:rPr>
         <w:t>Callback Hell</w:t>
       </w:r>
@@ -6046,8 +5609,16 @@
           <w:numId w:val="2"/>
         </w:numPr>
         <w:ind w:left="1800"/>
-      </w:pPr>
-      <w:r>
+        <w:rPr>
+          <w:sz w:val="22"/>
+          <w:szCs w:val="22"/>
+        </w:rPr>
+      </w:pPr>
+      <w:r>
+        <w:rPr>
+          <w:sz w:val="22"/>
+          <w:szCs w:val="22"/>
+        </w:rPr>
         <w:t>Callback hell occurs when multiple asynchronous functions are nested inside each other in such a way that the code becomes difficult to read and maintain. It happens when you need to perform multiple asynchronous operations one after the other, and each operation depends on the result of the previous one.</w:t>
       </w:r>
     </w:p>
@@ -6055,6 +5626,10 @@
       <w:pPr>
         <w:pStyle w:val="NormalWeb"/>
         <w:ind w:left="1800"/>
+        <w:rPr>
+          <w:sz w:val="22"/>
+          <w:szCs w:val="22"/>
+        </w:rPr>
       </w:pPr>
     </w:p>
     <w:p>
@@ -6064,22 +5639,20 @@
           <w:ilvl w:val="1"/>
           <w:numId w:val="2"/>
         </w:numPr>
+        <w:rPr>
+          <w:sz w:val="22"/>
+          <w:szCs w:val="22"/>
+        </w:rPr>
       </w:pPr>
       <w:r>
         <w:rPr>
           <w:rStyle w:val="Strong"/>
           <w:b/>
           <w:bCs/>
-        </w:rPr>
-        <w:t>I</w:t>
-      </w:r>
-      <w:r>
-        <w:rPr>
-          <w:rStyle w:val="Strong"/>
-          <w:b/>
-          <w:bCs/>
-        </w:rPr>
-        <w:t>nversion of Control (IoC) in JavaScript</w:t>
+          <w:sz w:val="22"/>
+          <w:szCs w:val="22"/>
+        </w:rPr>
+        <w:t>Inversion of Control (IoC) in JavaScript</w:t>
       </w:r>
     </w:p>
     <w:p>
@@ -6090,44 +5663,76 @@
           <w:numId w:val="2"/>
         </w:numPr>
         <w:ind w:left="1800"/>
-      </w:pPr>
-      <w:r>
+        <w:rPr>
+          <w:sz w:val="22"/>
+          <w:szCs w:val="22"/>
+        </w:rPr>
+      </w:pPr>
+      <w:r>
+        <w:rPr>
+          <w:sz w:val="22"/>
+          <w:szCs w:val="22"/>
+        </w:rPr>
         <w:t xml:space="preserve">Inversion of Control (IoC) refers to a design principle where the control of flow (or logic) is reversed compared to traditional procedural programming. In simpler terms, instead of a calling function directly dictating what happens step-by-step, control is passed to an external function, framework, or library. This principle is often used with </w:t>
       </w:r>
       <w:r>
         <w:rPr>
           <w:rStyle w:val="Strong"/>
+          <w:sz w:val="22"/>
+          <w:szCs w:val="22"/>
         </w:rPr>
         <w:t>callbacks</w:t>
       </w:r>
       <w:r>
+        <w:rPr>
+          <w:sz w:val="22"/>
+          <w:szCs w:val="22"/>
+        </w:rPr>
         <w:t xml:space="preserve">, </w:t>
       </w:r>
       <w:r>
         <w:rPr>
           <w:rStyle w:val="Strong"/>
+          <w:sz w:val="22"/>
+          <w:szCs w:val="22"/>
         </w:rPr>
         <w:t>event listeners</w:t>
       </w:r>
       <w:r>
+        <w:rPr>
+          <w:sz w:val="22"/>
+          <w:szCs w:val="22"/>
+        </w:rPr>
         <w:t xml:space="preserve">, </w:t>
       </w:r>
       <w:r>
         <w:rPr>
           <w:rStyle w:val="Strong"/>
+          <w:sz w:val="22"/>
+          <w:szCs w:val="22"/>
         </w:rPr>
         <w:t>dependency injection</w:t>
       </w:r>
       <w:r>
+        <w:rPr>
+          <w:sz w:val="22"/>
+          <w:szCs w:val="22"/>
+        </w:rPr>
         <w:t xml:space="preserve">, and </w:t>
       </w:r>
       <w:r>
         <w:rPr>
           <w:rStyle w:val="Strong"/>
+          <w:sz w:val="22"/>
+          <w:szCs w:val="22"/>
         </w:rPr>
         <w:t>frameworks</w:t>
       </w:r>
       <w:r>
+        <w:rPr>
+          <w:sz w:val="22"/>
+          <w:szCs w:val="22"/>
+        </w:rPr>
         <w:t>.</w:t>
       </w:r>
     </w:p>
@@ -6135,6 +5740,10 @@
       <w:pPr>
         <w:pStyle w:val="NormalWeb"/>
         <w:ind w:left="1800"/>
+        <w:rPr>
+          <w:sz w:val="22"/>
+          <w:szCs w:val="22"/>
+        </w:rPr>
       </w:pPr>
     </w:p>
     <w:p>
@@ -6145,6 +5754,10 @@
           <w:numId w:val="2"/>
         </w:numPr>
         <w:ind w:left="1800"/>
+        <w:rPr>
+          <w:sz w:val="22"/>
+          <w:szCs w:val="22"/>
+        </w:rPr>
       </w:pPr>
       <w:r>
         <w:rPr>
@@ -6152,6 +5765,8 @@
           <w:b w:val="0"/>
           <w:bCs w:val="0"/>
           <w:color w:val="000000" w:themeColor="text1"/>
+          <w:sz w:val="22"/>
+          <w:szCs w:val="22"/>
         </w:rPr>
         <w:t>Callback Example and IoC:</w:t>
       </w:r>
@@ -6164,28 +5779,306 @@
           <w:numId w:val="2"/>
         </w:numPr>
         <w:ind w:left="2520"/>
-      </w:pPr>
-      <w:r>
+        <w:rPr>
+          <w:sz w:val="22"/>
+          <w:szCs w:val="22"/>
+        </w:rPr>
+      </w:pPr>
+      <w:r>
+        <w:rPr>
+          <w:sz w:val="22"/>
+          <w:szCs w:val="22"/>
+        </w:rPr>
         <w:t xml:space="preserve">In JavaScript, </w:t>
       </w:r>
       <w:r>
         <w:rPr>
           <w:rStyle w:val="Strong"/>
+          <w:sz w:val="22"/>
+          <w:szCs w:val="22"/>
         </w:rPr>
         <w:t>callbacks</w:t>
       </w:r>
       <w:r>
+        <w:rPr>
+          <w:sz w:val="22"/>
+          <w:szCs w:val="22"/>
+        </w:rPr>
         <w:t xml:space="preserve"> introduce a form of IoC because we pass the control of a function to another function, typically provided by the environment (like the browser or Node.js). The callback function's execution is no longer directly under the control of the original calling code.</w:t>
       </w:r>
     </w:p>
     <w:p>
       <w:pPr>
+        <w:pStyle w:val="NormalWeb"/>
+        <w:numPr>
+          <w:ilvl w:val="0"/>
+          <w:numId w:val="2"/>
+        </w:numPr>
+        <w:rPr>
+          <w:sz w:val="22"/>
+          <w:szCs w:val="22"/>
+        </w:rPr>
+      </w:pPr>
+      <w:r>
+        <w:rPr>
+          <w:sz w:val="22"/>
+          <w:szCs w:val="22"/>
+        </w:rPr>
+        <w:t>Promises:</w:t>
+      </w:r>
+    </w:p>
+    <w:p>
+      <w:pPr>
+        <w:pStyle w:val="NormalWeb"/>
+        <w:numPr>
+          <w:ilvl w:val="1"/>
+          <w:numId w:val="2"/>
+        </w:numPr>
+        <w:rPr>
+          <w:sz w:val="22"/>
+          <w:szCs w:val="22"/>
+        </w:rPr>
+      </w:pPr>
+      <w:r>
+        <w:rPr>
+          <w:sz w:val="22"/>
+          <w:szCs w:val="22"/>
+        </w:rPr>
+        <w:t xml:space="preserve">It is use to manage async operation in JS </w:t>
+      </w:r>
+    </w:p>
+    <w:p>
+      <w:pPr>
         <w:spacing w:before="100" w:beforeAutospacing="1" w:after="100" w:afterAutospacing="1" w:line="240" w:lineRule="auto"/>
         <w:rPr>
           <w:rFonts w:ascii="Times New Roman" w:eastAsia="Times New Roman" w:hAnsi="Times New Roman" w:cs="Times New Roman"/>
           <w:kern w:val="0"/>
-          <w:sz w:val="24"/>
-          <w:szCs w:val="24"/>
+          <w:lang w:eastAsia="en-IN" w:bidi="gu-IN"/>
+          <w14:ligatures w14:val="none"/>
+        </w:rPr>
+      </w:pPr>
+    </w:p>
+    <w:p>
+      <w:pPr>
+        <w:spacing w:before="100" w:beforeAutospacing="1" w:after="100" w:afterAutospacing="1" w:line="240" w:lineRule="auto"/>
+        <w:rPr>
+          <w:rFonts w:ascii="Times New Roman" w:eastAsia="Times New Roman" w:hAnsi="Times New Roman" w:cs="Times New Roman"/>
+          <w:kern w:val="0"/>
+          <w:lang w:eastAsia="en-IN" w:bidi="gu-IN"/>
+          <w14:ligatures w14:val="none"/>
+        </w:rPr>
+      </w:pPr>
+    </w:p>
+    <w:p>
+      <w:pPr>
+        <w:spacing w:before="100" w:beforeAutospacing="1" w:after="100" w:afterAutospacing="1" w:line="240" w:lineRule="auto"/>
+        <w:rPr>
+          <w:rFonts w:ascii="Times New Roman" w:eastAsia="Times New Roman" w:hAnsi="Times New Roman" w:cs="Times New Roman"/>
+          <w:kern w:val="0"/>
+          <w:lang w:eastAsia="en-IN" w:bidi="gu-IN"/>
+          <w14:ligatures w14:val="none"/>
+        </w:rPr>
+      </w:pPr>
+    </w:p>
+    <w:p>
+      <w:pPr>
+        <w:spacing w:before="100" w:beforeAutospacing="1" w:after="100" w:afterAutospacing="1" w:line="240" w:lineRule="auto"/>
+        <w:rPr>
+          <w:rFonts w:ascii="Times New Roman" w:eastAsia="Times New Roman" w:hAnsi="Times New Roman" w:cs="Times New Roman"/>
+          <w:kern w:val="0"/>
+          <w:lang w:eastAsia="en-IN" w:bidi="gu-IN"/>
+          <w14:ligatures w14:val="none"/>
+        </w:rPr>
+      </w:pPr>
+    </w:p>
+    <w:p>
+      <w:pPr>
+        <w:spacing w:before="100" w:beforeAutospacing="1" w:after="100" w:afterAutospacing="1" w:line="240" w:lineRule="auto"/>
+        <w:rPr>
+          <w:rFonts w:ascii="Times New Roman" w:eastAsia="Times New Roman" w:hAnsi="Times New Roman" w:cs="Times New Roman"/>
+          <w:kern w:val="0"/>
+          <w:lang w:eastAsia="en-IN" w:bidi="gu-IN"/>
+          <w14:ligatures w14:val="none"/>
+        </w:rPr>
+      </w:pPr>
+    </w:p>
+    <w:p>
+      <w:pPr>
+        <w:spacing w:before="100" w:beforeAutospacing="1" w:after="100" w:afterAutospacing="1" w:line="240" w:lineRule="auto"/>
+        <w:rPr>
+          <w:rFonts w:ascii="Times New Roman" w:eastAsia="Times New Roman" w:hAnsi="Times New Roman" w:cs="Times New Roman"/>
+          <w:kern w:val="0"/>
+          <w:lang w:eastAsia="en-IN" w:bidi="gu-IN"/>
+          <w14:ligatures w14:val="none"/>
+        </w:rPr>
+      </w:pPr>
+    </w:p>
+    <w:p>
+      <w:pPr>
+        <w:spacing w:before="100" w:beforeAutospacing="1" w:after="100" w:afterAutospacing="1" w:line="240" w:lineRule="auto"/>
+        <w:rPr>
+          <w:rFonts w:ascii="Times New Roman" w:eastAsia="Times New Roman" w:hAnsi="Times New Roman" w:cs="Times New Roman"/>
+          <w:kern w:val="0"/>
+          <w:lang w:eastAsia="en-IN" w:bidi="gu-IN"/>
+          <w14:ligatures w14:val="none"/>
+        </w:rPr>
+      </w:pPr>
+    </w:p>
+    <w:p>
+      <w:pPr>
+        <w:spacing w:before="100" w:beforeAutospacing="1" w:after="100" w:afterAutospacing="1" w:line="240" w:lineRule="auto"/>
+        <w:rPr>
+          <w:rFonts w:ascii="Times New Roman" w:eastAsia="Times New Roman" w:hAnsi="Times New Roman" w:cs="Times New Roman"/>
+          <w:kern w:val="0"/>
+          <w:lang w:eastAsia="en-IN" w:bidi="gu-IN"/>
+          <w14:ligatures w14:val="none"/>
+        </w:rPr>
+      </w:pPr>
+    </w:p>
+    <w:p>
+      <w:pPr>
+        <w:spacing w:before="100" w:beforeAutospacing="1" w:after="100" w:afterAutospacing="1" w:line="240" w:lineRule="auto"/>
+        <w:rPr>
+          <w:rFonts w:ascii="Times New Roman" w:eastAsia="Times New Roman" w:hAnsi="Times New Roman" w:cs="Times New Roman"/>
+          <w:kern w:val="0"/>
+          <w:lang w:eastAsia="en-IN" w:bidi="gu-IN"/>
+          <w14:ligatures w14:val="none"/>
+        </w:rPr>
+      </w:pPr>
+    </w:p>
+    <w:p>
+      <w:pPr>
+        <w:spacing w:before="100" w:beforeAutospacing="1" w:after="100" w:afterAutospacing="1" w:line="240" w:lineRule="auto"/>
+        <w:rPr>
+          <w:rFonts w:ascii="Times New Roman" w:eastAsia="Times New Roman" w:hAnsi="Times New Roman" w:cs="Times New Roman"/>
+          <w:kern w:val="0"/>
+          <w:lang w:eastAsia="en-IN" w:bidi="gu-IN"/>
+          <w14:ligatures w14:val="none"/>
+        </w:rPr>
+      </w:pPr>
+    </w:p>
+    <w:p>
+      <w:pPr>
+        <w:spacing w:before="100" w:beforeAutospacing="1" w:after="100" w:afterAutospacing="1" w:line="240" w:lineRule="auto"/>
+        <w:rPr>
+          <w:rFonts w:ascii="Times New Roman" w:eastAsia="Times New Roman" w:hAnsi="Times New Roman" w:cs="Times New Roman"/>
+          <w:kern w:val="0"/>
+          <w:lang w:eastAsia="en-IN" w:bidi="gu-IN"/>
+          <w14:ligatures w14:val="none"/>
+        </w:rPr>
+      </w:pPr>
+      <w:r>
+        <w:rPr>
+          <w:rFonts w:ascii="Times New Roman" w:eastAsia="Times New Roman" w:hAnsi="Times New Roman" w:cs="Times New Roman"/>
+          <w:kern w:val="0"/>
+          <w:lang w:eastAsia="en-IN" w:bidi="gu-IN"/>
+          <w14:ligatures w14:val="none"/>
+        </w:rPr>
+        <w:lastRenderedPageBreak/>
+        <w:t>Async &amp; Await:</w:t>
+      </w:r>
+    </w:p>
+    <w:p>
+      <w:pPr>
+        <w:pStyle w:val="ListParagraph"/>
+        <w:numPr>
+          <w:ilvl w:val="0"/>
+          <w:numId w:val="2"/>
+        </w:numPr>
+        <w:spacing w:before="100" w:beforeAutospacing="1" w:after="100" w:afterAutospacing="1" w:line="240" w:lineRule="auto"/>
+        <w:rPr>
+          <w:rFonts w:ascii="Times New Roman" w:eastAsia="Times New Roman" w:hAnsi="Times New Roman" w:cs="Times New Roman"/>
+          <w:kern w:val="0"/>
+          <w:lang w:eastAsia="en-IN" w:bidi="gu-IN"/>
+          <w14:ligatures w14:val="none"/>
+        </w:rPr>
+      </w:pPr>
+      <w:r>
+        <w:rPr>
+          <w:rFonts w:ascii="Times New Roman" w:eastAsia="Times New Roman" w:hAnsi="Times New Roman" w:cs="Times New Roman"/>
+          <w:b/>
+          <w:bCs/>
+          <w:kern w:val="0"/>
+          <w:lang w:eastAsia="en-IN" w:bidi="gu-IN"/>
+          <w14:ligatures w14:val="none"/>
+        </w:rPr>
+        <w:t>async</w:t>
+      </w:r>
+      <w:r>
+        <w:rPr>
+          <w:rFonts w:ascii="Times New Roman" w:eastAsia="Times New Roman" w:hAnsi="Times New Roman" w:cs="Times New Roman"/>
+          <w:kern w:val="0"/>
+          <w:lang w:eastAsia="en-IN" w:bidi="gu-IN"/>
+          <w14:ligatures w14:val="none"/>
+        </w:rPr>
+        <w:t>: It is a keyword which use before create asynchronous function</w:t>
+      </w:r>
+      <w:r>
+        <w:rPr>
+          <w:rFonts w:ascii="Times New Roman" w:eastAsia="Times New Roman" w:hAnsi="Times New Roman" w:cs="Times New Roman"/>
+          <w:kern w:val="0"/>
+          <w:lang w:eastAsia="en-IN" w:bidi="gu-IN"/>
+          <w14:ligatures w14:val="none"/>
+        </w:rPr>
+        <w:t>.</w:t>
+      </w:r>
+    </w:p>
+    <w:p>
+      <w:pPr>
+        <w:pStyle w:val="ListParagraph"/>
+        <w:numPr>
+          <w:ilvl w:val="0"/>
+          <w:numId w:val="2"/>
+        </w:numPr>
+        <w:spacing w:before="100" w:beforeAutospacing="1" w:after="100" w:afterAutospacing="1" w:line="240" w:lineRule="auto"/>
+        <w:rPr>
+          <w:rFonts w:ascii="Times New Roman" w:eastAsia="Times New Roman" w:hAnsi="Times New Roman" w:cs="Times New Roman"/>
+          <w:kern w:val="0"/>
+          <w:lang w:eastAsia="en-IN" w:bidi="gu-IN"/>
+          <w14:ligatures w14:val="none"/>
+        </w:rPr>
+      </w:pPr>
+      <w:r>
+        <w:rPr>
+          <w:rFonts w:ascii="Times New Roman" w:eastAsia="Times New Roman" w:hAnsi="Times New Roman" w:cs="Times New Roman"/>
+          <w:kern w:val="0"/>
+          <w:lang w:eastAsia="en-IN" w:bidi="gu-IN"/>
+          <w14:ligatures w14:val="none"/>
+        </w:rPr>
+        <w:t xml:space="preserve">Async function always returns a </w:t>
+      </w:r>
+      <w:r>
+        <w:rPr>
+          <w:rFonts w:ascii="Times New Roman" w:eastAsia="Times New Roman" w:hAnsi="Times New Roman" w:cs="Times New Roman"/>
+          <w:b/>
+          <w:bCs/>
+          <w:kern w:val="0"/>
+          <w:lang w:eastAsia="en-IN" w:bidi="gu-IN"/>
+          <w14:ligatures w14:val="none"/>
+        </w:rPr>
+        <w:t xml:space="preserve">promise. </w:t>
+      </w:r>
+      <w:r>
+        <w:rPr>
+          <w:rFonts w:ascii="Times New Roman" w:eastAsia="Times New Roman" w:hAnsi="Times New Roman" w:cs="Times New Roman"/>
+          <w:kern w:val="0"/>
+          <w:lang w:eastAsia="en-IN" w:bidi="gu-IN"/>
+          <w14:ligatures w14:val="none"/>
+        </w:rPr>
+        <w:t>If you return any other data types then this function wraps that value into promise object and then return.</w:t>
+      </w:r>
+    </w:p>
+    <w:p>
+      <w:pPr>
+        <w:pStyle w:val="ListParagraph"/>
+        <w:numPr>
+          <w:ilvl w:val="0"/>
+          <w:numId w:val="2"/>
+        </w:numPr>
+        <w:spacing w:before="100" w:beforeAutospacing="1" w:after="100" w:afterAutospacing="1" w:line="240" w:lineRule="auto"/>
+        <w:rPr>
+          <w:rFonts w:ascii="Times New Roman" w:eastAsia="Times New Roman" w:hAnsi="Times New Roman" w:cs="Times New Roman"/>
+          <w:kern w:val="0"/>
           <w:lang w:eastAsia="en-IN" w:bidi="gu-IN"/>
           <w14:ligatures w14:val="none"/>
         </w:rPr>
@@ -7811,6 +7704,7 @@
   <w:style w:type="character" w:default="1" w:styleId="DefaultParagraphFont">
     <w:name w:val="Default Paragraph Font"/>
     <w:uiPriority w:val="1"/>
+    <w:semiHidden/>
     <w:unhideWhenUsed/>
   </w:style>
   <w:style w:type="table" w:default="1" w:styleId="TableNormal">

</xml_diff>